<commit_message>
Module thông báo và nhắc hạn: hạ tầng WebSocket/STOMP, thông báo lưu trước đẩy sau, lấy bù khi kết nối lại
</commit_message>
<xml_diff>
--- a/docx/05-api.docx
+++ b/docx/05-api.docx
@@ -907,7 +907,7 @@
         <w:rPr>
           <w:rStyle w:val="DataTypeTok"/>
         </w:rPr>
-        <w:t xml:space="preserve">"message"</w:t>
+        <w:t xml:space="preserve">"errorCode"</w:t>
       </w:r>
       <w:r>
         <w:rPr>
@@ -925,6 +925,45 @@
         <w:rPr>
           <w:rStyle w:val="StringTok"/>
         </w:rPr>
+        <w:t xml:space="preserve">"DEADLINE_PASSED"</w:t>
+      </w:r>
+      <w:r>
+        <w:rPr>
+          <w:rStyle w:val="FunctionTok"/>
+        </w:rPr>
+        <w:t xml:space="preserve">,</w:t>
+      </w:r>
+      <w:r>
+        <w:br/>
+      </w:r>
+      <w:r>
+        <w:rPr>
+          <w:rStyle w:val="NormalTok"/>
+        </w:rPr>
+        <w:t xml:space="preserve">  </w:t>
+      </w:r>
+      <w:r>
+        <w:rPr>
+          <w:rStyle w:val="DataTypeTok"/>
+        </w:rPr>
+        <w:t xml:space="preserve">"errorMessage"</w:t>
+      </w:r>
+      <w:r>
+        <w:rPr>
+          <w:rStyle w:val="FunctionTok"/>
+        </w:rPr>
+        <w:t xml:space="preserve">:</w:t>
+      </w:r>
+      <w:r>
+        <w:rPr>
+          <w:rStyle w:val="NormalTok"/>
+        </w:rPr>
+        <w:t xml:space="preserve"> </w:t>
+      </w:r>
+      <w:r>
+        <w:rPr>
+          <w:rStyle w:val="StringTok"/>
+        </w:rPr>
         <w:t xml:space="preserve">"Đã quá hạn nộp"</w:t>
       </w:r>
       <w:r>
@@ -946,7 +985,7 @@
         <w:rPr>
           <w:rStyle w:val="DataTypeTok"/>
         </w:rPr>
-        <w:t xml:space="preserve">"code"</w:t>
+        <w:t xml:space="preserve">"status"</w:t>
       </w:r>
       <w:r>
         <w:rPr>
@@ -962,9 +1001,48 @@
       </w:r>
       <w:r>
         <w:rPr>
+          <w:rStyle w:val="DecValTok"/>
+        </w:rPr>
+        <w:t xml:space="preserve">422</w:t>
+      </w:r>
+      <w:r>
+        <w:rPr>
+          <w:rStyle w:val="FunctionTok"/>
+        </w:rPr>
+        <w:t xml:space="preserve">,</w:t>
+      </w:r>
+      <w:r>
+        <w:br/>
+      </w:r>
+      <w:r>
+        <w:rPr>
+          <w:rStyle w:val="NormalTok"/>
+        </w:rPr>
+        <w:t xml:space="preserve">  </w:t>
+      </w:r>
+      <w:r>
+        <w:rPr>
+          <w:rStyle w:val="DataTypeTok"/>
+        </w:rPr>
+        <w:t xml:space="preserve">"path"</w:t>
+      </w:r>
+      <w:r>
+        <w:rPr>
+          <w:rStyle w:val="FunctionTok"/>
+        </w:rPr>
+        <w:t xml:space="preserve">:</w:t>
+      </w:r>
+      <w:r>
+        <w:rPr>
+          <w:rStyle w:val="NormalTok"/>
+        </w:rPr>
+        <w:t xml:space="preserve"> </w:t>
+      </w:r>
+      <w:r>
+        <w:rPr>
           <w:rStyle w:val="StringTok"/>
         </w:rPr>
-        <w:t xml:space="preserve">"DEADLINE_PASSED"</w:t>
+        <w:t xml:space="preserve">"/api/student/parts/12/submit"</w:t>
       </w:r>
       <w:r>
         <w:rPr>
@@ -985,7 +1063,7 @@
         <w:rPr>
           <w:rStyle w:val="DataTypeTok"/>
         </w:rPr>
-        <w:t xml:space="preserve">"status"</w:t>
+        <w:t xml:space="preserve">"timestamp"</w:t>
       </w:r>
       <w:r>
         <w:rPr>
@@ -1001,9 +1079,9 @@
       </w:r>
       <w:r>
         <w:rPr>
-          <w:rStyle w:val="DecValTok"/>
-        </w:rPr>
-        <w:t xml:space="preserve">422</w:t>
+          <w:rStyle w:val="StringTok"/>
+        </w:rPr>
+        <w:t xml:space="preserve">"2026-11-05T17:00:03Z"</w:t>
       </w:r>
       <w:r>
         <w:rPr>
@@ -1024,7 +1102,7 @@
         <w:rPr>
           <w:rStyle w:val="DataTypeTok"/>
         </w:rPr>
-        <w:t xml:space="preserve">"path"</w:t>
+        <w:t xml:space="preserve">"fieldErrors"</w:t>
       </w:r>
       <w:r>
         <w:rPr>
@@ -1040,139 +1118,61 @@
       </w:r>
       <w:r>
         <w:rPr>
+          <w:rStyle w:val="FunctionTok"/>
+        </w:rPr>
+        <w:t xml:space="preserve">{</w:t>
+      </w:r>
+      <w:r>
+        <w:rPr>
+          <w:rStyle w:val="NormalTok"/>
+        </w:rPr>
+        <w:t xml:space="preserve"> </w:t>
+      </w:r>
+      <w:r>
+        <w:rPr>
+          <w:rStyle w:val="DataTypeTok"/>
+        </w:rPr>
+        <w:t xml:space="preserve">"content"</w:t>
+      </w:r>
+      <w:r>
+        <w:rPr>
+          <w:rStyle w:val="FunctionTok"/>
+        </w:rPr>
+        <w:t xml:space="preserve">:</w:t>
+      </w:r>
+      <w:r>
+        <w:rPr>
+          <w:rStyle w:val="NormalTok"/>
+        </w:rPr>
+        <w:t xml:space="preserve"> </w:t>
+      </w:r>
+      <w:r>
+        <w:rPr>
           <w:rStyle w:val="StringTok"/>
         </w:rPr>
-        <w:t xml:space="preserve">"/api/student/parts/12/submit"</w:t>
+        <w:t xml:space="preserve">"Nội dung không được để trống"</w:t>
+      </w:r>
+      <w:r>
+        <w:rPr>
+          <w:rStyle w:val="NormalTok"/>
+        </w:rPr>
+        <w:t xml:space="preserve"> </w:t>
       </w:r>
       <w:r>
         <w:rPr>
           <w:rStyle w:val="FunctionTok"/>
         </w:rPr>
-        <w:t xml:space="preserve">,</w:t>
+        <w:t xml:space="preserve">}</w:t>
       </w:r>
       <w:r>
         <w:br/>
       </w:r>
       <w:r>
         <w:rPr>
-          <w:rStyle w:val="NormalTok"/>
-        </w:rPr>
-        <w:t xml:space="preserve">  </w:t>
-      </w:r>
-      <w:r>
-        <w:rPr>
-          <w:rStyle w:val="DataTypeTok"/>
-        </w:rPr>
-        <w:t xml:space="preserve">"timestamp"</w:t>
-      </w:r>
-      <w:r>
-        <w:rPr>
           <w:rStyle w:val="FunctionTok"/>
         </w:rPr>
-        <w:t xml:space="preserve">:</w:t>
-      </w:r>
-      <w:r>
-        <w:rPr>
-          <w:rStyle w:val="NormalTok"/>
-        </w:rPr>
-        <w:t xml:space="preserve"> </w:t>
-      </w:r>
-      <w:r>
-        <w:rPr>
-          <w:rStyle w:val="StringTok"/>
-        </w:rPr>
-        <w:t xml:space="preserve">"2026-11-05T17:00:03Z"</w:t>
-      </w:r>
-      <w:r>
-        <w:rPr>
-          <w:rStyle w:val="FunctionTok"/>
-        </w:rPr>
-        <w:t xml:space="preserve">,</w:t>
-      </w:r>
-      <w:r>
-        <w:br/>
-      </w:r>
-      <w:r>
-        <w:rPr>
-          <w:rStyle w:val="NormalTok"/>
-        </w:rPr>
-        <w:t xml:space="preserve">  </w:t>
-      </w:r>
-      <w:r>
-        <w:rPr>
-          <w:rStyle w:val="DataTypeTok"/>
-        </w:rPr>
-        <w:t xml:space="preserve">"fieldErrors"</w:t>
-      </w:r>
-      <w:r>
-        <w:rPr>
-          <w:rStyle w:val="FunctionTok"/>
-        </w:rPr>
-        <w:t xml:space="preserve">:</w:t>
-      </w:r>
-      <w:r>
-        <w:rPr>
-          <w:rStyle w:val="NormalTok"/>
-        </w:rPr>
-        <w:t xml:space="preserve"> </w:t>
-      </w:r>
-      <w:r>
-        <w:rPr>
-          <w:rStyle w:val="FunctionTok"/>
-        </w:rPr>
-        <w:t xml:space="preserve">{</w:t>
-      </w:r>
-      <w:r>
-        <w:rPr>
-          <w:rStyle w:val="NormalTok"/>
-        </w:rPr>
-        <w:t xml:space="preserve"> </w:t>
-      </w:r>
-      <w:r>
-        <w:rPr>
-          <w:rStyle w:val="DataTypeTok"/>
-        </w:rPr>
-        <w:t xml:space="preserve">"content"</w:t>
-      </w:r>
-      <w:r>
-        <w:rPr>
-          <w:rStyle w:val="FunctionTok"/>
-        </w:rPr>
-        <w:t xml:space="preserve">:</w:t>
-      </w:r>
-      <w:r>
-        <w:rPr>
-          <w:rStyle w:val="NormalTok"/>
-        </w:rPr>
-        <w:t xml:space="preserve"> </w:t>
-      </w:r>
-      <w:r>
-        <w:rPr>
-          <w:rStyle w:val="StringTok"/>
-        </w:rPr>
-        <w:t xml:space="preserve">"Nội dung không được để trống"</w:t>
-      </w:r>
-      <w:r>
-        <w:rPr>
-          <w:rStyle w:val="NormalTok"/>
-        </w:rPr>
-        <w:t xml:space="preserve"> </w:t>
-      </w:r>
-      <w:r>
-        <w:rPr>
-          <w:rStyle w:val="FunctionTok"/>
-        </w:rPr>
         <w:t xml:space="preserve">}</w:t>
       </w:r>
-      <w:r>
-        <w:br/>
-      </w:r>
-      <w:r>
-        <w:rPr>
-          <w:rStyle w:val="FunctionTok"/>
-        </w:rPr>
-        <w:t xml:space="preserve">}</w:t>
-      </w:r>
     </w:p>
     <w:p>
       <w:pPr>
@@ -1180,6 +1180,124 @@
       </w:pPr>
       <w:r>
         <w:rPr>
+          <w:b/>
+          <w:bCs/>
+        </w:rPr>
+        <w:t xml:space="preserve">HTTP status luôn là</w:t>
+      </w:r>
+      <w:r>
+        <w:rPr>
+          <w:b/>
+          <w:bCs/>
+        </w:rPr>
+        <w:t xml:space="preserve"> </w:t>
+      </w:r>
+      <w:r>
+        <w:rPr>
+          <w:rStyle w:val="VerbatimChar"/>
+          <w:b/>
+          <w:bCs/>
+        </w:rPr>
+        <w:t xml:space="preserve">200</w:t>
+      </w:r>
+      <w:r>
+        <w:t xml:space="preserve"> </w:t>
+      </w:r>
+      <w:r>
+        <w:t xml:space="preserve">(kể cả khi lỗi, kể cả lỗi của Spring Security như chưa đăng nhập / không có quyền). Kết quả thật đọc trong body:</w:t>
+      </w:r>
+      <w:r>
+        <w:t xml:space="preserve"> </w:t>
+      </w:r>
+      <w:r>
+        <w:rPr>
+          <w:rStyle w:val="VerbatimChar"/>
+        </w:rPr>
+        <w:t xml:space="preserve">success</w:t>
+      </w:r>
+      <w:r>
+        <w:t xml:space="preserve">; khi lỗi thì</w:t>
+      </w:r>
+      <w:r>
+        <w:t xml:space="preserve"> </w:t>
+      </w:r>
+      <w:r>
+        <w:rPr>
+          <w:rStyle w:val="VerbatimChar"/>
+        </w:rPr>
+        <w:t xml:space="preserve">errorCode</w:t>
+      </w:r>
+      <w:r>
+        <w:t xml:space="preserve"> </w:t>
+      </w:r>
+      <w:r>
+        <w:t xml:space="preserve">(mã lỗi, bảng dưới),</w:t>
+      </w:r>
+      <w:r>
+        <w:t xml:space="preserve"> </w:t>
+      </w:r>
+      <w:r>
+        <w:rPr>
+          <w:rStyle w:val="VerbatimChar"/>
+        </w:rPr>
+        <w:t xml:space="preserve">errorMessage</w:t>
+      </w:r>
+      <w:r>
+        <w:t xml:space="preserve"> </w:t>
+      </w:r>
+      <w:r>
+        <w:t xml:space="preserve">(câu tiếng Việt hiển thị thẳng cho người dùng) và</w:t>
+      </w:r>
+      <w:r>
+        <w:t xml:space="preserve"> </w:t>
+      </w:r>
+      <w:r>
+        <w:rPr>
+          <w:rStyle w:val="VerbatimChar"/>
+        </w:rPr>
+        <w:t xml:space="preserve">status</w:t>
+      </w:r>
+      <w:r>
+        <w:t xml:space="preserve"> </w:t>
+      </w:r>
+      <w:r>
+        <w:t xml:space="preserve">(mã kiểu HTTP: 400, 401, 403, 404, 409, 422, 429, 500 — để phân loại lỗi, vd</w:t>
+      </w:r>
+      <w:r>
+        <w:t xml:space="preserve"> </w:t>
+      </w:r>
+      <w:r>
+        <w:rPr>
+          <w:rStyle w:val="VerbatimChar"/>
+        </w:rPr>
+        <w:t xml:space="preserve">401</w:t>
+      </w:r>
+      <w:r>
+        <w:t xml:space="preserve"> </w:t>
+      </w:r>
+      <w:r>
+        <w:t xml:space="preserve">→ client refresh token rồi gửi lại).</w:t>
+      </w:r>
+      <w:r>
+        <w:t xml:space="preserve"> </w:t>
+      </w:r>
+      <w:r>
+        <w:rPr>
+          <w:rStyle w:val="VerbatimChar"/>
+        </w:rPr>
+        <w:t xml:space="preserve">fieldErrors</w:t>
+      </w:r>
+      <w:r>
+        <w:t xml:space="preserve"> </w:t>
+      </w:r>
+      <w:r>
+        <w:t xml:space="preserve">chỉ có khi lỗi validate. Response thành công không có các trường này;</w:t>
+      </w:r>
+      <w:r>
+        <w:t xml:space="preserve"> </w:t>
+      </w:r>
+      <w:r>
+        <w:rPr>
           <w:rStyle w:val="VerbatimChar"/>
         </w:rPr>
         <w:t xml:space="preserve">message</w:t>
@@ -1188,22 +1306,115 @@
         <w:t xml:space="preserve"> </w:t>
       </w:r>
       <w:r>
-        <w:t xml:space="preserve">là câu tiếng Việt hiển thị thẳng cho người dùng.</w:t>
-      </w:r>
-      <w:r>
-        <w:t xml:space="preserve"> </w:t>
-      </w:r>
-      <w:r>
-        <w:rPr>
-          <w:rStyle w:val="VerbatimChar"/>
-        </w:rPr>
-        <w:t xml:space="preserve">fieldErrors</w:t>
-      </w:r>
-      <w:r>
-        <w:t xml:space="preserve"> </w:t>
-      </w:r>
-      <w:r>
-        <w:t xml:space="preserve">chỉ có khi lỗi validate.</w:t>
+        <w:t xml:space="preserve">ở response thành công là câu thông báo (vd "Đã gửi email"). Trong tài liệu này, các chỗ ghi "→</w:t>
+      </w:r>
+      <w:r>
+        <w:t xml:space="preserve"> </w:t>
+      </w:r>
+      <w:r>
+        <w:rPr>
+          <w:rStyle w:val="VerbatimChar"/>
+        </w:rPr>
+        <w:t xml:space="preserve">409</w:t>
+      </w:r>
+      <w:r>
+        <w:t xml:space="preserve">", "</w:t>
+      </w:r>
+      <w:r>
+        <w:rPr>
+          <w:rStyle w:val="VerbatimChar"/>
+        </w:rPr>
+        <w:t xml:space="preserve">429 RATE_LIMITED</w:t>
+      </w:r>
+      <w:r>
+        <w:t xml:space="preserve">"… là giá trị</w:t>
+      </w:r>
+      <w:r>
+        <w:t xml:space="preserve"> </w:t>
+      </w:r>
+      <w:r>
+        <w:rPr>
+          <w:rStyle w:val="VerbatimChar"/>
+        </w:rPr>
+        <w:t xml:space="preserve">status</w:t>
+      </w:r>
+      <w:r>
+        <w:t xml:space="preserve"> </w:t>
+      </w:r>
+      <w:r>
+        <w:t xml:space="preserve">trong body; endpoint tạo mới trước đây trả</w:t>
+      </w:r>
+      <w:r>
+        <w:t xml:space="preserve"> </w:t>
+      </w:r>
+      <w:r>
+        <w:rPr>
+          <w:rStyle w:val="VerbatimChar"/>
+        </w:rPr>
+        <w:t xml:space="preserve">201</w:t>
+      </w:r>
+      <w:r>
+        <w:t xml:space="preserve"> </w:t>
+      </w:r>
+      <w:r>
+        <w:t xml:space="preserve">nay trả</w:t>
+      </w:r>
+      <w:r>
+        <w:t xml:space="preserve"> </w:t>
+      </w:r>
+      <w:r>
+        <w:rPr>
+          <w:rStyle w:val="VerbatimChar"/>
+        </w:rPr>
+        <w:t xml:space="preserve">200</w:t>
+      </w:r>
+      <w:r>
+        <w:t xml:space="preserve">. Ngoại lệ ngoài ứng dụng: lỗi mạng, nginx (</w:t>
+      </w:r>
+      <w:r>
+        <w:rPr>
+          <w:rStyle w:val="VerbatimChar"/>
+        </w:rPr>
+        <w:t xml:space="preserve">502</w:t>
+      </w:r>
+      <w:r>
+        <w:t xml:space="preserve">/</w:t>
+      </w:r>
+      <w:r>
+        <w:rPr>
+          <w:rStyle w:val="VerbatimChar"/>
+        </w:rPr>
+        <w:t xml:space="preserve">504</w:t>
+      </w:r>
+      <w:r>
+        <w:t xml:space="preserve">) và</w:t>
+      </w:r>
+      <w:r>
+        <w:t xml:space="preserve"> </w:t>
+      </w:r>
+      <w:r>
+        <w:rPr>
+          <w:rStyle w:val="VerbatimChar"/>
+        </w:rPr>
+        <w:t xml:space="preserve">/actuator/health</w:t>
+      </w:r>
+      <w:r>
+        <w:t xml:space="preserve"> </w:t>
+      </w:r>
+      <w:r>
+        <w:t xml:space="preserve">(</w:t>
+      </w:r>
+      <w:r>
+        <w:rPr>
+          <w:rStyle w:val="VerbatimChar"/>
+        </w:rPr>
+        <w:t xml:space="preserve">503</w:t>
+      </w:r>
+      <w:r>
+        <w:t xml:space="preserve"> </w:t>
+      </w:r>
+      <w:r>
+        <w:t xml:space="preserve">khi hỏng) vẫn dùng HTTP status thật.</w:t>
       </w:r>
     </w:p>
     <w:bookmarkEnd w:id="12"/>
@@ -1238,21 +1449,24 @@
               <w:pStyle w:val="Compact"/>
             </w:pPr>
             <w:r>
-              <w:t xml:space="preserve">HTTP</w:t>
-            </w:r>
-          </w:p>
-        </w:tc>
-        <w:tc>
-          <w:tcPr/>
-          <w:p>
-            <w:pPr>
-              <w:pStyle w:val="Compact"/>
-            </w:pPr>
-            <w:r>
-              <w:rPr>
-                <w:rStyle w:val="VerbatimChar"/>
-              </w:rPr>
-              <w:t xml:space="preserve">code</w:t>
+              <w:rPr>
+                <w:rStyle w:val="VerbatimChar"/>
+              </w:rPr>
+              <w:t xml:space="preserve">status</w:t>
+            </w:r>
+          </w:p>
+        </w:tc>
+        <w:tc>
+          <w:tcPr/>
+          <w:p>
+            <w:pPr>
+              <w:pStyle w:val="Compact"/>
+            </w:pPr>
+            <w:r>
+              <w:rPr>
+                <w:rStyle w:val="VerbatimChar"/>
+              </w:rPr>
+              <w:t xml:space="preserve">errorCode</w:t>
             </w:r>
           </w:p>
         </w:tc>
@@ -6504,22 +6718,7 @@
               <w:pStyle w:val="Compact"/>
             </w:pPr>
             <w:r>
-              <w:t xml:space="preserve">Nhân bản →</w:t>
-            </w:r>
-            <w:r>
-              <w:t xml:space="preserve"> </w:t>
-            </w:r>
-            <w:r>
-              <w:rPr>
-                <w:rStyle w:val="VerbatimChar"/>
-              </w:rPr>
-              <w:t xml:space="preserve">201</w:t>
-            </w:r>
-            <w:r>
-              <w:t xml:space="preserve"> </w:t>
-            </w:r>
-            <w:r>
-              <w:t xml:space="preserve">bài DRAFT mới "… (bản sao)": đủ phần và rubric;</w:t>
+              <w:t xml:space="preserve">Nhân bản → bài DRAFT mới "… (bản sao)": đủ phần và rubric;</w:t>
             </w:r>
             <w:r>
               <w:t xml:space="preserve"> </w:t>
@@ -6909,7 +7108,7 @@
         <w:rPr>
           <w:rStyle w:val="VerbatimChar"/>
         </w:rPr>
-        <w:t xml:space="preserve">201 {url: "/uploads/yyyy/MM/&lt;uuid&gt;.png"}</w:t>
+        <w:t xml:space="preserve">{url: "/uploads/yyyy/MM/&lt;uuid&gt;.png"}</w:t>
       </w:r>
       <w:r>
         <w:t xml:space="preserve">.</w:t>
@@ -10422,7 +10621,7 @@
               <w:rPr>
                 <w:rStyle w:val="VerbatimChar"/>
               </w:rPr>
-              <w:t xml:space="preserve">201 ErrorCodeDto</w:t>
+              <w:t xml:space="preserve">200 ErrorCodeDto</w:t>
             </w:r>
           </w:p>
         </w:tc>
@@ -10598,7 +10797,7 @@
               <w:rPr>
                 <w:rStyle w:val="VerbatimChar"/>
               </w:rPr>
-              <w:t xml:space="preserve">201 CommentBankDto</w:t>
+              <w:t xml:space="preserve">200 CommentBankDto</w:t>
             </w:r>
           </w:p>
         </w:tc>
@@ -12856,7 +13055,7 @@
               <w:rPr>
                 <w:rStyle w:val="VerbatimChar"/>
               </w:rPr>
-              <w:t xml:space="preserve">201 {versionNo, submittedAt, late, wordCount}</w:t>
+              <w:t xml:space="preserve">200 {versionNo, submittedAt, late, wordCount}</w:t>
             </w:r>
             <w:r>
               <w:t xml:space="preserve"> </w:t>
@@ -13478,7 +13677,7 @@
         <w:rPr>
           <w:rStyle w:val="VerbatimChar"/>
         </w:rPr>
-        <w:t xml:space="preserve">201 {versionNo, submittedAt, late, wordCount}</w:t>
+        <w:t xml:space="preserve">200 {versionNo, submittedAt, late, wordCount}</w:t>
       </w:r>
       <w:r>
         <w:t xml:space="preserve">. Lỗi:</w:t>
@@ -13508,21 +13707,24 @@
               <w:pStyle w:val="Compact"/>
             </w:pPr>
             <w:r>
-              <w:t xml:space="preserve">HTTP</w:t>
-            </w:r>
-          </w:p>
-        </w:tc>
-        <w:tc>
-          <w:tcPr/>
-          <w:p>
-            <w:pPr>
-              <w:pStyle w:val="Compact"/>
-            </w:pPr>
-            <w:r>
-              <w:rPr>
-                <w:rStyle w:val="VerbatimChar"/>
-              </w:rPr>
-              <w:t xml:space="preserve">code</w:t>
+              <w:rPr>
+                <w:rStyle w:val="VerbatimChar"/>
+              </w:rPr>
+              <w:t xml:space="preserve">status</w:t>
+            </w:r>
+          </w:p>
+        </w:tc>
+        <w:tc>
+          <w:tcPr/>
+          <w:p>
+            <w:pPr>
+              <w:pStyle w:val="Compact"/>
+            </w:pPr>
+            <w:r>
+              <w:rPr>
+                <w:rStyle w:val="VerbatimChar"/>
+              </w:rPr>
+              <w:t xml:space="preserve">errorCode</w:t>
             </w:r>
           </w:p>
         </w:tc>
@@ -16401,10 +16603,13 @@
         <w:rPr>
           <w:rStyle w:val="VerbatimChar"/>
         </w:rPr>
-        <w:t xml:space="preserve">{code, message}</w:t>
-      </w:r>
-      <w:r>
-        <w:t xml:space="preserve">; không lưu, không phát.</w:t>
+        <w:t xml:space="preserve">{errorCode, errorMessage}</w:t>
+      </w:r>
+      <w:r>
+        <w:t xml:space="preserve"> </w:t>
+      </w:r>
+      <w:r>
+        <w:t xml:space="preserve">(cùng tên trường với body lỗi REST); không lưu, không phát.</w:t>
       </w:r>
     </w:p>
     <w:p>
@@ -18281,7 +18486,7 @@
               <w:rPr>
                 <w:rStyle w:val="VerbatimChar"/>
               </w:rPr>
-              <w:t xml:space="preserve">{code, message}</w:t>
+              <w:t xml:space="preserve">{errorCode, errorMessage}</w:t>
             </w:r>
             <w:r>
               <w:t xml:space="preserve"> </w:t>

</xml_diff>

<commit_message>
Frontend F1 → F3a theo thiết kế Figma Make; API luôn trả HTTP 200 với errorCode / errorMessage
- F1: đăng nhập, đổi mật khẩu, khung app (sidebar, header), STOMP client dùng chung,
  chuông + trang Thông báo, banner mất kết nối, hộp thoại FORCE_LOGOUT
- F2: 5 màn quản trị; lớp học, thành viên, import sinh viên (kết quả, file tài khoản)
- F3a: danh sách / chi tiết bài tập, cài đặt, giao bài và phát hành, đóng / mở lại / nhân bản / xoá
- Backend: body lỗi đổi thành errorCode / errorMessage, HTTP luôn 200 (mã thật ở trường status);
  test dùng apiStatus(...), k6 kiểm tra success, docs/05 + quy tắc code cập nhật

Co-Authored-By: Claude Opus 5.5 <noreply@anthropic.com>
</commit_message>
<xml_diff>
--- a/docx/05-api.docx
+++ b/docx/05-api.docx
@@ -907,7 +907,7 @@
         <w:rPr>
           <w:rStyle w:val="DataTypeTok"/>
         </w:rPr>
-        <w:t xml:space="preserve">"message"</w:t>
+        <w:t xml:space="preserve">"errorCode"</w:t>
       </w:r>
       <w:r>
         <w:rPr>
@@ -925,6 +925,45 @@
         <w:rPr>
           <w:rStyle w:val="StringTok"/>
         </w:rPr>
+        <w:t xml:space="preserve">"DEADLINE_PASSED"</w:t>
+      </w:r>
+      <w:r>
+        <w:rPr>
+          <w:rStyle w:val="FunctionTok"/>
+        </w:rPr>
+        <w:t xml:space="preserve">,</w:t>
+      </w:r>
+      <w:r>
+        <w:br/>
+      </w:r>
+      <w:r>
+        <w:rPr>
+          <w:rStyle w:val="NormalTok"/>
+        </w:rPr>
+        <w:t xml:space="preserve">  </w:t>
+      </w:r>
+      <w:r>
+        <w:rPr>
+          <w:rStyle w:val="DataTypeTok"/>
+        </w:rPr>
+        <w:t xml:space="preserve">"errorMessage"</w:t>
+      </w:r>
+      <w:r>
+        <w:rPr>
+          <w:rStyle w:val="FunctionTok"/>
+        </w:rPr>
+        <w:t xml:space="preserve">:</w:t>
+      </w:r>
+      <w:r>
+        <w:rPr>
+          <w:rStyle w:val="NormalTok"/>
+        </w:rPr>
+        <w:t xml:space="preserve"> </w:t>
+      </w:r>
+      <w:r>
+        <w:rPr>
+          <w:rStyle w:val="StringTok"/>
+        </w:rPr>
         <w:t xml:space="preserve">"Đã quá hạn nộp"</w:t>
       </w:r>
       <w:r>
@@ -946,7 +985,7 @@
         <w:rPr>
           <w:rStyle w:val="DataTypeTok"/>
         </w:rPr>
-        <w:t xml:space="preserve">"code"</w:t>
+        <w:t xml:space="preserve">"status"</w:t>
       </w:r>
       <w:r>
         <w:rPr>
@@ -962,9 +1001,48 @@
       </w:r>
       <w:r>
         <w:rPr>
+          <w:rStyle w:val="DecValTok"/>
+        </w:rPr>
+        <w:t xml:space="preserve">422</w:t>
+      </w:r>
+      <w:r>
+        <w:rPr>
+          <w:rStyle w:val="FunctionTok"/>
+        </w:rPr>
+        <w:t xml:space="preserve">,</w:t>
+      </w:r>
+      <w:r>
+        <w:br/>
+      </w:r>
+      <w:r>
+        <w:rPr>
+          <w:rStyle w:val="NormalTok"/>
+        </w:rPr>
+        <w:t xml:space="preserve">  </w:t>
+      </w:r>
+      <w:r>
+        <w:rPr>
+          <w:rStyle w:val="DataTypeTok"/>
+        </w:rPr>
+        <w:t xml:space="preserve">"path"</w:t>
+      </w:r>
+      <w:r>
+        <w:rPr>
+          <w:rStyle w:val="FunctionTok"/>
+        </w:rPr>
+        <w:t xml:space="preserve">:</w:t>
+      </w:r>
+      <w:r>
+        <w:rPr>
+          <w:rStyle w:val="NormalTok"/>
+        </w:rPr>
+        <w:t xml:space="preserve"> </w:t>
+      </w:r>
+      <w:r>
+        <w:rPr>
           <w:rStyle w:val="StringTok"/>
         </w:rPr>
-        <w:t xml:space="preserve">"DEADLINE_PASSED"</w:t>
+        <w:t xml:space="preserve">"/api/student/parts/12/submit"</w:t>
       </w:r>
       <w:r>
         <w:rPr>
@@ -985,7 +1063,7 @@
         <w:rPr>
           <w:rStyle w:val="DataTypeTok"/>
         </w:rPr>
-        <w:t xml:space="preserve">"status"</w:t>
+        <w:t xml:space="preserve">"timestamp"</w:t>
       </w:r>
       <w:r>
         <w:rPr>
@@ -1001,9 +1079,9 @@
       </w:r>
       <w:r>
         <w:rPr>
-          <w:rStyle w:val="DecValTok"/>
-        </w:rPr>
-        <w:t xml:space="preserve">422</w:t>
+          <w:rStyle w:val="StringTok"/>
+        </w:rPr>
+        <w:t xml:space="preserve">"2026-11-05T17:00:03Z"</w:t>
       </w:r>
       <w:r>
         <w:rPr>
@@ -1024,7 +1102,7 @@
         <w:rPr>
           <w:rStyle w:val="DataTypeTok"/>
         </w:rPr>
-        <w:t xml:space="preserve">"path"</w:t>
+        <w:t xml:space="preserve">"fieldErrors"</w:t>
       </w:r>
       <w:r>
         <w:rPr>
@@ -1040,139 +1118,61 @@
       </w:r>
       <w:r>
         <w:rPr>
+          <w:rStyle w:val="FunctionTok"/>
+        </w:rPr>
+        <w:t xml:space="preserve">{</w:t>
+      </w:r>
+      <w:r>
+        <w:rPr>
+          <w:rStyle w:val="NormalTok"/>
+        </w:rPr>
+        <w:t xml:space="preserve"> </w:t>
+      </w:r>
+      <w:r>
+        <w:rPr>
+          <w:rStyle w:val="DataTypeTok"/>
+        </w:rPr>
+        <w:t xml:space="preserve">"content"</w:t>
+      </w:r>
+      <w:r>
+        <w:rPr>
+          <w:rStyle w:val="FunctionTok"/>
+        </w:rPr>
+        <w:t xml:space="preserve">:</w:t>
+      </w:r>
+      <w:r>
+        <w:rPr>
+          <w:rStyle w:val="NormalTok"/>
+        </w:rPr>
+        <w:t xml:space="preserve"> </w:t>
+      </w:r>
+      <w:r>
+        <w:rPr>
           <w:rStyle w:val="StringTok"/>
         </w:rPr>
-        <w:t xml:space="preserve">"/api/student/parts/12/submit"</w:t>
+        <w:t xml:space="preserve">"Nội dung không được để trống"</w:t>
+      </w:r>
+      <w:r>
+        <w:rPr>
+          <w:rStyle w:val="NormalTok"/>
+        </w:rPr>
+        <w:t xml:space="preserve"> </w:t>
       </w:r>
       <w:r>
         <w:rPr>
           <w:rStyle w:val="FunctionTok"/>
         </w:rPr>
-        <w:t xml:space="preserve">,</w:t>
+        <w:t xml:space="preserve">}</w:t>
       </w:r>
       <w:r>
         <w:br/>
       </w:r>
       <w:r>
         <w:rPr>
-          <w:rStyle w:val="NormalTok"/>
-        </w:rPr>
-        <w:t xml:space="preserve">  </w:t>
-      </w:r>
-      <w:r>
-        <w:rPr>
-          <w:rStyle w:val="DataTypeTok"/>
-        </w:rPr>
-        <w:t xml:space="preserve">"timestamp"</w:t>
-      </w:r>
-      <w:r>
-        <w:rPr>
           <w:rStyle w:val="FunctionTok"/>
         </w:rPr>
-        <w:t xml:space="preserve">:</w:t>
-      </w:r>
-      <w:r>
-        <w:rPr>
-          <w:rStyle w:val="NormalTok"/>
-        </w:rPr>
-        <w:t xml:space="preserve"> </w:t>
-      </w:r>
-      <w:r>
-        <w:rPr>
-          <w:rStyle w:val="StringTok"/>
-        </w:rPr>
-        <w:t xml:space="preserve">"2026-11-05T17:00:03Z"</w:t>
-      </w:r>
-      <w:r>
-        <w:rPr>
-          <w:rStyle w:val="FunctionTok"/>
-        </w:rPr>
-        <w:t xml:space="preserve">,</w:t>
-      </w:r>
-      <w:r>
-        <w:br/>
-      </w:r>
-      <w:r>
-        <w:rPr>
-          <w:rStyle w:val="NormalTok"/>
-        </w:rPr>
-        <w:t xml:space="preserve">  </w:t>
-      </w:r>
-      <w:r>
-        <w:rPr>
-          <w:rStyle w:val="DataTypeTok"/>
-        </w:rPr>
-        <w:t xml:space="preserve">"fieldErrors"</w:t>
-      </w:r>
-      <w:r>
-        <w:rPr>
-          <w:rStyle w:val="FunctionTok"/>
-        </w:rPr>
-        <w:t xml:space="preserve">:</w:t>
-      </w:r>
-      <w:r>
-        <w:rPr>
-          <w:rStyle w:val="NormalTok"/>
-        </w:rPr>
-        <w:t xml:space="preserve"> </w:t>
-      </w:r>
-      <w:r>
-        <w:rPr>
-          <w:rStyle w:val="FunctionTok"/>
-        </w:rPr>
-        <w:t xml:space="preserve">{</w:t>
-      </w:r>
-      <w:r>
-        <w:rPr>
-          <w:rStyle w:val="NormalTok"/>
-        </w:rPr>
-        <w:t xml:space="preserve"> </w:t>
-      </w:r>
-      <w:r>
-        <w:rPr>
-          <w:rStyle w:val="DataTypeTok"/>
-        </w:rPr>
-        <w:t xml:space="preserve">"content"</w:t>
-      </w:r>
-      <w:r>
-        <w:rPr>
-          <w:rStyle w:val="FunctionTok"/>
-        </w:rPr>
-        <w:t xml:space="preserve">:</w:t>
-      </w:r>
-      <w:r>
-        <w:rPr>
-          <w:rStyle w:val="NormalTok"/>
-        </w:rPr>
-        <w:t xml:space="preserve"> </w:t>
-      </w:r>
-      <w:r>
-        <w:rPr>
-          <w:rStyle w:val="StringTok"/>
-        </w:rPr>
-        <w:t xml:space="preserve">"Nội dung không được để trống"</w:t>
-      </w:r>
-      <w:r>
-        <w:rPr>
-          <w:rStyle w:val="NormalTok"/>
-        </w:rPr>
-        <w:t xml:space="preserve"> </w:t>
-      </w:r>
-      <w:r>
-        <w:rPr>
-          <w:rStyle w:val="FunctionTok"/>
-        </w:rPr>
         <w:t xml:space="preserve">}</w:t>
       </w:r>
-      <w:r>
-        <w:br/>
-      </w:r>
-      <w:r>
-        <w:rPr>
-          <w:rStyle w:val="FunctionTok"/>
-        </w:rPr>
-        <w:t xml:space="preserve">}</w:t>
-      </w:r>
     </w:p>
     <w:p>
       <w:pPr>
@@ -1180,6 +1180,124 @@
       </w:pPr>
       <w:r>
         <w:rPr>
+          <w:b/>
+          <w:bCs/>
+        </w:rPr>
+        <w:t xml:space="preserve">HTTP status luôn là</w:t>
+      </w:r>
+      <w:r>
+        <w:rPr>
+          <w:b/>
+          <w:bCs/>
+        </w:rPr>
+        <w:t xml:space="preserve"> </w:t>
+      </w:r>
+      <w:r>
+        <w:rPr>
+          <w:rStyle w:val="VerbatimChar"/>
+          <w:b/>
+          <w:bCs/>
+        </w:rPr>
+        <w:t xml:space="preserve">200</w:t>
+      </w:r>
+      <w:r>
+        <w:t xml:space="preserve"> </w:t>
+      </w:r>
+      <w:r>
+        <w:t xml:space="preserve">(kể cả khi lỗi, kể cả lỗi của Spring Security như chưa đăng nhập / không có quyền). Kết quả thật đọc trong body:</w:t>
+      </w:r>
+      <w:r>
+        <w:t xml:space="preserve"> </w:t>
+      </w:r>
+      <w:r>
+        <w:rPr>
+          <w:rStyle w:val="VerbatimChar"/>
+        </w:rPr>
+        <w:t xml:space="preserve">success</w:t>
+      </w:r>
+      <w:r>
+        <w:t xml:space="preserve">; khi lỗi thì</w:t>
+      </w:r>
+      <w:r>
+        <w:t xml:space="preserve"> </w:t>
+      </w:r>
+      <w:r>
+        <w:rPr>
+          <w:rStyle w:val="VerbatimChar"/>
+        </w:rPr>
+        <w:t xml:space="preserve">errorCode</w:t>
+      </w:r>
+      <w:r>
+        <w:t xml:space="preserve"> </w:t>
+      </w:r>
+      <w:r>
+        <w:t xml:space="preserve">(mã lỗi, bảng dưới),</w:t>
+      </w:r>
+      <w:r>
+        <w:t xml:space="preserve"> </w:t>
+      </w:r>
+      <w:r>
+        <w:rPr>
+          <w:rStyle w:val="VerbatimChar"/>
+        </w:rPr>
+        <w:t xml:space="preserve">errorMessage</w:t>
+      </w:r>
+      <w:r>
+        <w:t xml:space="preserve"> </w:t>
+      </w:r>
+      <w:r>
+        <w:t xml:space="preserve">(câu tiếng Việt hiển thị thẳng cho người dùng) và</w:t>
+      </w:r>
+      <w:r>
+        <w:t xml:space="preserve"> </w:t>
+      </w:r>
+      <w:r>
+        <w:rPr>
+          <w:rStyle w:val="VerbatimChar"/>
+        </w:rPr>
+        <w:t xml:space="preserve">status</w:t>
+      </w:r>
+      <w:r>
+        <w:t xml:space="preserve"> </w:t>
+      </w:r>
+      <w:r>
+        <w:t xml:space="preserve">(mã kiểu HTTP: 400, 401, 403, 404, 409, 422, 429, 500 — để phân loại lỗi, vd</w:t>
+      </w:r>
+      <w:r>
+        <w:t xml:space="preserve"> </w:t>
+      </w:r>
+      <w:r>
+        <w:rPr>
+          <w:rStyle w:val="VerbatimChar"/>
+        </w:rPr>
+        <w:t xml:space="preserve">401</w:t>
+      </w:r>
+      <w:r>
+        <w:t xml:space="preserve"> </w:t>
+      </w:r>
+      <w:r>
+        <w:t xml:space="preserve">→ client refresh token rồi gửi lại).</w:t>
+      </w:r>
+      <w:r>
+        <w:t xml:space="preserve"> </w:t>
+      </w:r>
+      <w:r>
+        <w:rPr>
+          <w:rStyle w:val="VerbatimChar"/>
+        </w:rPr>
+        <w:t xml:space="preserve">fieldErrors</w:t>
+      </w:r>
+      <w:r>
+        <w:t xml:space="preserve"> </w:t>
+      </w:r>
+      <w:r>
+        <w:t xml:space="preserve">chỉ có khi lỗi validate. Response thành công không có các trường này;</w:t>
+      </w:r>
+      <w:r>
+        <w:t xml:space="preserve"> </w:t>
+      </w:r>
+      <w:r>
+        <w:rPr>
           <w:rStyle w:val="VerbatimChar"/>
         </w:rPr>
         <w:t xml:space="preserve">message</w:t>
@@ -1188,22 +1306,115 @@
         <w:t xml:space="preserve"> </w:t>
       </w:r>
       <w:r>
-        <w:t xml:space="preserve">là câu tiếng Việt hiển thị thẳng cho người dùng.</w:t>
-      </w:r>
-      <w:r>
-        <w:t xml:space="preserve"> </w:t>
-      </w:r>
-      <w:r>
-        <w:rPr>
-          <w:rStyle w:val="VerbatimChar"/>
-        </w:rPr>
-        <w:t xml:space="preserve">fieldErrors</w:t>
-      </w:r>
-      <w:r>
-        <w:t xml:space="preserve"> </w:t>
-      </w:r>
-      <w:r>
-        <w:t xml:space="preserve">chỉ có khi lỗi validate.</w:t>
+        <w:t xml:space="preserve">ở response thành công là câu thông báo (vd "Đã gửi email"). Trong tài liệu này, các chỗ ghi "→</w:t>
+      </w:r>
+      <w:r>
+        <w:t xml:space="preserve"> </w:t>
+      </w:r>
+      <w:r>
+        <w:rPr>
+          <w:rStyle w:val="VerbatimChar"/>
+        </w:rPr>
+        <w:t xml:space="preserve">409</w:t>
+      </w:r>
+      <w:r>
+        <w:t xml:space="preserve">", "</w:t>
+      </w:r>
+      <w:r>
+        <w:rPr>
+          <w:rStyle w:val="VerbatimChar"/>
+        </w:rPr>
+        <w:t xml:space="preserve">429 RATE_LIMITED</w:t>
+      </w:r>
+      <w:r>
+        <w:t xml:space="preserve">"… là giá trị</w:t>
+      </w:r>
+      <w:r>
+        <w:t xml:space="preserve"> </w:t>
+      </w:r>
+      <w:r>
+        <w:rPr>
+          <w:rStyle w:val="VerbatimChar"/>
+        </w:rPr>
+        <w:t xml:space="preserve">status</w:t>
+      </w:r>
+      <w:r>
+        <w:t xml:space="preserve"> </w:t>
+      </w:r>
+      <w:r>
+        <w:t xml:space="preserve">trong body; endpoint tạo mới trước đây trả</w:t>
+      </w:r>
+      <w:r>
+        <w:t xml:space="preserve"> </w:t>
+      </w:r>
+      <w:r>
+        <w:rPr>
+          <w:rStyle w:val="VerbatimChar"/>
+        </w:rPr>
+        <w:t xml:space="preserve">201</w:t>
+      </w:r>
+      <w:r>
+        <w:t xml:space="preserve"> </w:t>
+      </w:r>
+      <w:r>
+        <w:t xml:space="preserve">nay trả</w:t>
+      </w:r>
+      <w:r>
+        <w:t xml:space="preserve"> </w:t>
+      </w:r>
+      <w:r>
+        <w:rPr>
+          <w:rStyle w:val="VerbatimChar"/>
+        </w:rPr>
+        <w:t xml:space="preserve">200</w:t>
+      </w:r>
+      <w:r>
+        <w:t xml:space="preserve">. Ngoại lệ ngoài ứng dụng: lỗi mạng, nginx (</w:t>
+      </w:r>
+      <w:r>
+        <w:rPr>
+          <w:rStyle w:val="VerbatimChar"/>
+        </w:rPr>
+        <w:t xml:space="preserve">502</w:t>
+      </w:r>
+      <w:r>
+        <w:t xml:space="preserve">/</w:t>
+      </w:r>
+      <w:r>
+        <w:rPr>
+          <w:rStyle w:val="VerbatimChar"/>
+        </w:rPr>
+        <w:t xml:space="preserve">504</w:t>
+      </w:r>
+      <w:r>
+        <w:t xml:space="preserve">) và</w:t>
+      </w:r>
+      <w:r>
+        <w:t xml:space="preserve"> </w:t>
+      </w:r>
+      <w:r>
+        <w:rPr>
+          <w:rStyle w:val="VerbatimChar"/>
+        </w:rPr>
+        <w:t xml:space="preserve">/actuator/health</w:t>
+      </w:r>
+      <w:r>
+        <w:t xml:space="preserve"> </w:t>
+      </w:r>
+      <w:r>
+        <w:t xml:space="preserve">(</w:t>
+      </w:r>
+      <w:r>
+        <w:rPr>
+          <w:rStyle w:val="VerbatimChar"/>
+        </w:rPr>
+        <w:t xml:space="preserve">503</w:t>
+      </w:r>
+      <w:r>
+        <w:t xml:space="preserve"> </w:t>
+      </w:r>
+      <w:r>
+        <w:t xml:space="preserve">khi hỏng) vẫn dùng HTTP status thật.</w:t>
       </w:r>
     </w:p>
     <w:bookmarkEnd w:id="12"/>
@@ -1238,21 +1449,24 @@
               <w:pStyle w:val="Compact"/>
             </w:pPr>
             <w:r>
-              <w:t xml:space="preserve">HTTP</w:t>
-            </w:r>
-          </w:p>
-        </w:tc>
-        <w:tc>
-          <w:tcPr/>
-          <w:p>
-            <w:pPr>
-              <w:pStyle w:val="Compact"/>
-            </w:pPr>
-            <w:r>
-              <w:rPr>
-                <w:rStyle w:val="VerbatimChar"/>
-              </w:rPr>
-              <w:t xml:space="preserve">code</w:t>
+              <w:rPr>
+                <w:rStyle w:val="VerbatimChar"/>
+              </w:rPr>
+              <w:t xml:space="preserve">status</w:t>
+            </w:r>
+          </w:p>
+        </w:tc>
+        <w:tc>
+          <w:tcPr/>
+          <w:p>
+            <w:pPr>
+              <w:pStyle w:val="Compact"/>
+            </w:pPr>
+            <w:r>
+              <w:rPr>
+                <w:rStyle w:val="VerbatimChar"/>
+              </w:rPr>
+              <w:t xml:space="preserve">errorCode</w:t>
             </w:r>
           </w:p>
         </w:tc>
@@ -6504,22 +6718,7 @@
               <w:pStyle w:val="Compact"/>
             </w:pPr>
             <w:r>
-              <w:t xml:space="preserve">Nhân bản →</w:t>
-            </w:r>
-            <w:r>
-              <w:t xml:space="preserve"> </w:t>
-            </w:r>
-            <w:r>
-              <w:rPr>
-                <w:rStyle w:val="VerbatimChar"/>
-              </w:rPr>
-              <w:t xml:space="preserve">201</w:t>
-            </w:r>
-            <w:r>
-              <w:t xml:space="preserve"> </w:t>
-            </w:r>
-            <w:r>
-              <w:t xml:space="preserve">bài DRAFT mới "… (bản sao)": đủ phần và rubric;</w:t>
+              <w:t xml:space="preserve">Nhân bản → bài DRAFT mới "… (bản sao)": đủ phần và rubric;</w:t>
             </w:r>
             <w:r>
               <w:t xml:space="preserve"> </w:t>
@@ -6909,7 +7108,7 @@
         <w:rPr>
           <w:rStyle w:val="VerbatimChar"/>
         </w:rPr>
-        <w:t xml:space="preserve">201 {url: "/uploads/yyyy/MM/&lt;uuid&gt;.png"}</w:t>
+        <w:t xml:space="preserve">{url: "/uploads/yyyy/MM/&lt;uuid&gt;.png"}</w:t>
       </w:r>
       <w:r>
         <w:t xml:space="preserve">.</w:t>
@@ -10422,7 +10621,7 @@
               <w:rPr>
                 <w:rStyle w:val="VerbatimChar"/>
               </w:rPr>
-              <w:t xml:space="preserve">201 ErrorCodeDto</w:t>
+              <w:t xml:space="preserve">200 ErrorCodeDto</w:t>
             </w:r>
           </w:p>
         </w:tc>
@@ -10598,7 +10797,7 @@
               <w:rPr>
                 <w:rStyle w:val="VerbatimChar"/>
               </w:rPr>
-              <w:t xml:space="preserve">201 CommentBankDto</w:t>
+              <w:t xml:space="preserve">200 CommentBankDto</w:t>
             </w:r>
           </w:p>
         </w:tc>
@@ -12856,7 +13055,7 @@
               <w:rPr>
                 <w:rStyle w:val="VerbatimChar"/>
               </w:rPr>
-              <w:t xml:space="preserve">201 {versionNo, submittedAt, late, wordCount}</w:t>
+              <w:t xml:space="preserve">200 {versionNo, submittedAt, late, wordCount}</w:t>
             </w:r>
             <w:r>
               <w:t xml:space="preserve"> </w:t>
@@ -13478,7 +13677,7 @@
         <w:rPr>
           <w:rStyle w:val="VerbatimChar"/>
         </w:rPr>
-        <w:t xml:space="preserve">201 {versionNo, submittedAt, late, wordCount}</w:t>
+        <w:t xml:space="preserve">200 {versionNo, submittedAt, late, wordCount}</w:t>
       </w:r>
       <w:r>
         <w:t xml:space="preserve">. Lỗi:</w:t>
@@ -13508,21 +13707,24 @@
               <w:pStyle w:val="Compact"/>
             </w:pPr>
             <w:r>
-              <w:t xml:space="preserve">HTTP</w:t>
-            </w:r>
-          </w:p>
-        </w:tc>
-        <w:tc>
-          <w:tcPr/>
-          <w:p>
-            <w:pPr>
-              <w:pStyle w:val="Compact"/>
-            </w:pPr>
-            <w:r>
-              <w:rPr>
-                <w:rStyle w:val="VerbatimChar"/>
-              </w:rPr>
-              <w:t xml:space="preserve">code</w:t>
+              <w:rPr>
+                <w:rStyle w:val="VerbatimChar"/>
+              </w:rPr>
+              <w:t xml:space="preserve">status</w:t>
+            </w:r>
+          </w:p>
+        </w:tc>
+        <w:tc>
+          <w:tcPr/>
+          <w:p>
+            <w:pPr>
+              <w:pStyle w:val="Compact"/>
+            </w:pPr>
+            <w:r>
+              <w:rPr>
+                <w:rStyle w:val="VerbatimChar"/>
+              </w:rPr>
+              <w:t xml:space="preserve">errorCode</w:t>
             </w:r>
           </w:p>
         </w:tc>
@@ -16401,10 +16603,13 @@
         <w:rPr>
           <w:rStyle w:val="VerbatimChar"/>
         </w:rPr>
-        <w:t xml:space="preserve">{code, message}</w:t>
-      </w:r>
-      <w:r>
-        <w:t xml:space="preserve">; không lưu, không phát.</w:t>
+        <w:t xml:space="preserve">{errorCode, errorMessage}</w:t>
+      </w:r>
+      <w:r>
+        <w:t xml:space="preserve"> </w:t>
+      </w:r>
+      <w:r>
+        <w:t xml:space="preserve">(cùng tên trường với body lỗi REST); không lưu, không phát.</w:t>
       </w:r>
     </w:p>
     <w:p>
@@ -18281,7 +18486,7 @@
               <w:rPr>
                 <w:rStyle w:val="VerbatimChar"/>
               </w:rPr>
-              <w:t xml:space="preserve">{code, message}</w:t>
+              <w:t xml:space="preserve">{errorCode, errorMessage}</w:t>
             </w:r>
             <w:r>
               <w:t xml:space="preserve"> </w:t>

</xml_diff>

<commit_message>
Module viết bài và nộp bài: trình soạn, đếm từ khi gõ, tự lưu nháp sau 3 giây
</commit_message>
<xml_diff>
--- a/docx/05-api.docx
+++ b/docx/05-api.docx
@@ -12829,18 +12829,33 @@
               <w:rPr>
                 <w:rStyle w:val="VerbatimChar"/>
               </w:rPr>
-              <w:t xml:space="preserve">/api/student/assignments?tab=TODO|DUE_SOON|OVERDUE|SUBMITTED|REVISION&amp;page&amp;size</w:t>
-            </w:r>
-          </w:p>
-        </w:tc>
-        <w:tc>
-          <w:tcPr/>
-          <w:p>
-            <w:pPr>
-              <w:pStyle w:val="Compact"/>
-            </w:pPr>
-            <w:r>
-              <w:t xml:space="preserve">Bài được giao, theo tab (UC-22)</w:t>
+              <w:t xml:space="preserve">/api/student/assignments?tab=TODO|DUE_SOON|OVERDUE|SUBMITTED|REVISION</w:t>
+            </w:r>
+          </w:p>
+        </w:tc>
+        <w:tc>
+          <w:tcPr/>
+          <w:p>
+            <w:pPr>
+              <w:pStyle w:val="Compact"/>
+            </w:pPr>
+            <w:r>
+              <w:t xml:space="preserve">Bài được giao, theo tab (UC-22); bỏ trống</w:t>
+            </w:r>
+            <w:r>
+              <w:t xml:space="preserve"> </w:t>
+            </w:r>
+            <w:r>
+              <w:rPr>
+                <w:rStyle w:val="VerbatimChar"/>
+              </w:rPr>
+              <w:t xml:space="preserve">tab</w:t>
+            </w:r>
+            <w:r>
+              <w:t xml:space="preserve"> </w:t>
+            </w:r>
+            <w:r>
+              <w:t xml:space="preserve">= mọi bài. Không phân trang</w:t>
             </w:r>
           </w:p>
         </w:tc>
@@ -14176,6 +14191,30 @@
           <w:rStyle w:val="VerbatimChar"/>
         </w:rPr>
         <w:t xml:space="preserve">description</w:t>
+      </w:r>
+      <w:r>
+        <w:t xml:space="preserve">,</w:t>
+      </w:r>
+      <w:r>
+        <w:t xml:space="preserve"> </w:t>
+      </w:r>
+      <w:r>
+        <w:rPr>
+          <w:rStyle w:val="VerbatimChar"/>
+        </w:rPr>
+        <w:t xml:space="preserve">teacherName</w:t>
+      </w:r>
+      <w:r>
+        <w:t xml:space="preserve">,</w:t>
+      </w:r>
+      <w:r>
+        <w:t xml:space="preserve"> </w:t>
+      </w:r>
+      <w:r>
+        <w:rPr>
+          <w:rStyle w:val="VerbatimChar"/>
+        </w:rPr>
+        <w:t xml:space="preserve">tabs</w:t>
       </w:r>
       <w:r>
         <w:t xml:space="preserve">,</w:t>

</xml_diff>

<commit_message>
Frontend F4a: sinh viên xem bài được giao theo tab và chi tiết bài
- Bài được giao: 5 tab có số đếm (giữ trên URL), thẻ bài với trạng thái từng phần, hạn + đếm ngược, nút chính theo tình trạng
- Chi tiết bài: yêu cầu sửa (hạn, lời nhắn), đề + tiêu chí từng phần, lịch sử nộp, band từng phần và cả bài, 404 khi không được giao
- CountdownTimer đếm theo giờ server (serverClock, lấy độ lệch từ serverTime); thêm BandBadge
- docs/05: API danh sách sinh viên không phân trang; docs/10 mục 7 hướng dẫn sinh viên; xuất lại Word

Co-Authored-By: Claude Opus 5.5 <noreply@anthropic.com>
</commit_message>
<xml_diff>
--- a/docx/05-api.docx
+++ b/docx/05-api.docx
@@ -12829,18 +12829,33 @@
               <w:rPr>
                 <w:rStyle w:val="VerbatimChar"/>
               </w:rPr>
-              <w:t xml:space="preserve">/api/student/assignments?tab=TODO|DUE_SOON|OVERDUE|SUBMITTED|REVISION&amp;page&amp;size</w:t>
-            </w:r>
-          </w:p>
-        </w:tc>
-        <w:tc>
-          <w:tcPr/>
-          <w:p>
-            <w:pPr>
-              <w:pStyle w:val="Compact"/>
-            </w:pPr>
-            <w:r>
-              <w:t xml:space="preserve">Bài được giao, theo tab (UC-22)</w:t>
+              <w:t xml:space="preserve">/api/student/assignments?tab=TODO|DUE_SOON|OVERDUE|SUBMITTED|REVISION</w:t>
+            </w:r>
+          </w:p>
+        </w:tc>
+        <w:tc>
+          <w:tcPr/>
+          <w:p>
+            <w:pPr>
+              <w:pStyle w:val="Compact"/>
+            </w:pPr>
+            <w:r>
+              <w:t xml:space="preserve">Bài được giao, theo tab (UC-22); bỏ trống</w:t>
+            </w:r>
+            <w:r>
+              <w:t xml:space="preserve"> </w:t>
+            </w:r>
+            <w:r>
+              <w:rPr>
+                <w:rStyle w:val="VerbatimChar"/>
+              </w:rPr>
+              <w:t xml:space="preserve">tab</w:t>
+            </w:r>
+            <w:r>
+              <w:t xml:space="preserve"> </w:t>
+            </w:r>
+            <w:r>
+              <w:t xml:space="preserve">= mọi bài. Không phân trang</w:t>
             </w:r>
           </w:p>
         </w:tc>
@@ -14176,6 +14191,30 @@
           <w:rStyle w:val="VerbatimChar"/>
         </w:rPr>
         <w:t xml:space="preserve">description</w:t>
+      </w:r>
+      <w:r>
+        <w:t xml:space="preserve">,</w:t>
+      </w:r>
+      <w:r>
+        <w:t xml:space="preserve"> </w:t>
+      </w:r>
+      <w:r>
+        <w:rPr>
+          <w:rStyle w:val="VerbatimChar"/>
+        </w:rPr>
+        <w:t xml:space="preserve">teacherName</w:t>
+      </w:r>
+      <w:r>
+        <w:t xml:space="preserve">,</w:t>
+      </w:r>
+      <w:r>
+        <w:t xml:space="preserve"> </w:t>
+      </w:r>
+      <w:r>
+        <w:rPr>
+          <w:rStyle w:val="VerbatimChar"/>
+        </w:rPr>
+        <w:t xml:space="preserve">tabs</w:t>
       </w:r>
       <w:r>
         <w:t xml:space="preserve">,</w:t>

</xml_diff>

<commit_message>
Module paper theo nhóm: chấm thang 10, cộng / trừ điểm thành viên, live comments trên tài liệu
</commit_message>
<xml_diff>
--- a/docx/05-api.docx
+++ b/docx/05-api.docx
@@ -13713,7 +13713,85 @@
         </w:numPr>
       </w:pPr>
       <w:r>
-        <w:t xml:space="preserve">Chưa làm (B25c / B25e): hàng đợi chấm vẫn hiện điểm làm tròn kiểu IELTS và chưa ghi tên nhóm; kết quả phía sinh viên chưa hiện điểm riêng của mình.</w:t>
+        <w:rPr>
+          <w:rStyle w:val="VerbatimChar"/>
+        </w:rPr>
+        <w:t xml:space="preserve">GradingScreen</w:t>
+      </w:r>
+      <w:r>
+        <w:t xml:space="preserve"> </w:t>
+      </w:r>
+      <w:r>
+        <w:t xml:space="preserve">(B25c-2) thêm</w:t>
+      </w:r>
+      <w:r>
+        <w:t xml:space="preserve"> </w:t>
+      </w:r>
+      <w:r>
+        <w:rPr>
+          <w:rStyle w:val="VerbatimChar"/>
+        </w:rPr>
+        <w:t xml:space="preserve">assignment.citationStyle</w:t>
+      </w:r>
+      <w:r>
+        <w:t xml:space="preserve"> </w:t>
+      </w:r>
+      <w:r>
+        <w:t xml:space="preserve">và</w:t>
+      </w:r>
+      <w:r>
+        <w:t xml:space="preserve"> </w:t>
+      </w:r>
+      <w:r>
+        <w:rPr>
+          <w:rStyle w:val="VerbatimChar"/>
+        </w:rPr>
+        <w:t xml:space="preserve">version.contentJson</w:t>
+      </w:r>
+      <w:r>
+        <w:t xml:space="preserve"> </w:t>
+      </w:r>
+      <w:r>
+        <w:t xml:space="preserve">/</w:t>
+      </w:r>
+      <w:r>
+        <w:t xml:space="preserve"> </w:t>
+      </w:r>
+      <w:r>
+        <w:rPr>
+          <w:rStyle w:val="VerbatimChar"/>
+        </w:rPr>
+        <w:t xml:space="preserve">version.references</w:t>
+      </w:r>
+      <w:r>
+        <w:t xml:space="preserve"> </w:t>
+      </w:r>
+      <w:r>
+        <w:t xml:space="preserve">(</w:t>
+      </w:r>
+      <w:r>
+        <w:rPr>
+          <w:rStyle w:val="VerbatimChar"/>
+        </w:rPr>
+        <w:t xml:space="preserve">[{id, csl}]</w:t>
+      </w:r>
+      <w:r>
+        <w:t xml:space="preserve"> </w:t>
+      </w:r>
+      <w:r>
+        <w:t xml:space="preserve">— tài liệu được trích lúc nộp, giống phía sinh viên) để màn chấm hiện bài nộp có định dạng; bài luận để null.</w:t>
+      </w:r>
+    </w:p>
+    <w:p>
+      <w:pPr>
+        <w:pStyle w:val="Compact"/>
+        <w:numPr>
+          <w:ilvl w:val="0"/>
+          <w:numId w:val="1015"/>
+        </w:numPr>
+      </w:pPr>
+      <w:r>
+        <w:t xml:space="preserve">Chưa làm (B25c-3 / B25e): hàng đợi chấm vẫn hiện điểm làm tròn kiểu IELTS và chưa ghi tên nhóm; kết quả phía sinh viên chưa hiện điểm riêng của mình.</w:t>
       </w:r>
     </w:p>
     <w:p>
@@ -21017,6 +21095,132 @@
             </w:r>
             <w:r>
               <w:t xml:space="preserve">bị bỏ nội dung (giữ dòng cho thống kê)</w:t>
+            </w:r>
+          </w:p>
+        </w:tc>
+      </w:tr>
+      <w:tr>
+        <w:tc>
+          <w:tcPr/>
+          <w:p>
+            <w:pPr>
+              <w:pStyle w:val="Compact"/>
+            </w:pPr>
+            <w:r>
+              <w:t xml:space="preserve">GET</w:t>
+            </w:r>
+          </w:p>
+        </w:tc>
+        <w:tc>
+          <w:tcPr/>
+          <w:p>
+            <w:pPr>
+              <w:pStyle w:val="Compact"/>
+            </w:pPr>
+            <w:r>
+              <w:rPr>
+                <w:rStyle w:val="VerbatimChar"/>
+              </w:rPr>
+              <w:t xml:space="preserve">/api/papers/docs/{id}/comments</w:t>
+            </w:r>
+          </w:p>
+        </w:tc>
+        <w:tc>
+          <w:tcPr/>
+          <w:p>
+            <w:pPr>
+              <w:pStyle w:val="Compact"/>
+            </w:pPr>
+            <w:r>
+              <w:t xml:space="preserve">Thành viên nhóm hoặc giáo viên chủ bài lấy các nhận xét trực tiếp trên tài liệu</w:t>
+            </w:r>
+          </w:p>
+        </w:tc>
+      </w:tr>
+      <w:tr>
+        <w:tc>
+          <w:tcPr/>
+          <w:p>
+            <w:pPr>
+              <w:pStyle w:val="Compact"/>
+            </w:pPr>
+            <w:r>
+              <w:t xml:space="preserve">POST</w:t>
+            </w:r>
+          </w:p>
+        </w:tc>
+        <w:tc>
+          <w:tcPr/>
+          <w:p>
+            <w:pPr>
+              <w:pStyle w:val="Compact"/>
+            </w:pPr>
+            <w:r>
+              <w:rPr>
+                <w:rStyle w:val="VerbatimChar"/>
+              </w:rPr>
+              <w:t xml:space="preserve">/api/teacher/papers/docs/{id}/comments</w:t>
+            </w:r>
+          </w:p>
+        </w:tc>
+        <w:tc>
+          <w:tcPr/>
+          <w:p>
+            <w:pPr>
+              <w:pStyle w:val="Compact"/>
+            </w:pPr>
+            <w:r>
+              <w:t xml:space="preserve">Giáo viên thêm nhận xét với</w:t>
+            </w:r>
+            <w:r>
+              <w:t xml:space="preserve"> </w:t>
+            </w:r>
+            <w:r>
+              <w:rPr>
+                <w:rStyle w:val="VerbatimChar"/>
+              </w:rPr>
+              <w:t xml:space="preserve">{startOffset, endOffset, quote, comment}</w:t>
+            </w:r>
+            <w:r>
+              <w:t xml:space="preserve">; đoạn chọn tối đa 10.000 ký tự</w:t>
+            </w:r>
+          </w:p>
+        </w:tc>
+      </w:tr>
+      <w:tr>
+        <w:tc>
+          <w:tcPr/>
+          <w:p>
+            <w:pPr>
+              <w:pStyle w:val="Compact"/>
+            </w:pPr>
+            <w:r>
+              <w:t xml:space="preserve">PUT / DELETE</w:t>
+            </w:r>
+          </w:p>
+        </w:tc>
+        <w:tc>
+          <w:tcPr/>
+          <w:p>
+            <w:pPr>
+              <w:pStyle w:val="Compact"/>
+            </w:pPr>
+            <w:r>
+              <w:rPr>
+                <w:rStyle w:val="VerbatimChar"/>
+              </w:rPr>
+              <w:t xml:space="preserve">/api/teacher/papers/docs/{id}/comments/{commentId}</w:t>
+            </w:r>
+          </w:p>
+        </w:tc>
+        <w:tc>
+          <w:tcPr/>
+          <w:p>
+            <w:pPr>
+              <w:pStyle w:val="Compact"/>
+            </w:pPr>
+            <w:r>
+              <w:t xml:space="preserve">Giáo viên sửa nội dung hoặc xoá nhận xét của mình trên tài liệu</w:t>
             </w:r>
           </w:p>
         </w:tc>
@@ -27838,7 +28042,34 @@
         <w:rPr>
           <w:rStyle w:val="VerbatimChar"/>
         </w:rPr>
-        <w:t xml:space="preserve">/topic/paper/{id}[/awareness]</w:t>
+        <w:t xml:space="preserve">/topic/paper/{id}</w:t>
+      </w:r>
+      <w:r>
+        <w:t xml:space="preserve">,</w:t>
+      </w:r>
+      <w:r>
+        <w:t xml:space="preserve"> </w:t>
+      </w:r>
+      <w:r>
+        <w:rPr>
+          <w:rStyle w:val="VerbatimChar"/>
+        </w:rPr>
+        <w:t xml:space="preserve">/topic/paper/{id}/awareness</w:t>
+      </w:r>
+      <w:r>
+        <w:t xml:space="preserve"> </w:t>
+      </w:r>
+      <w:r>
+        <w:t xml:space="preserve">và</w:t>
+      </w:r>
+      <w:r>
+        <w:t xml:space="preserve"> </w:t>
+      </w:r>
+      <w:r>
+        <w:rPr>
+          <w:rStyle w:val="VerbatimChar"/>
+        </w:rPr>
+        <w:t xml:space="preserve">/topic/paper/{id}/comments</w:t>
       </w:r>
       <w:r>
         <w:t xml:space="preserve">; chỉ sinh viên SEND được</w:t>
@@ -27908,7 +28139,34 @@
         <w:t xml:space="preserve"> </w:t>
       </w:r>
       <w:r>
-        <w:t xml:space="preserve">không bỏ sót. Lỗi (không phải thành viên</w:t>
+        <w:t xml:space="preserve">không bỏ sót. Nhận xét trực tiếp phát sau commit trên</w:t>
+      </w:r>
+      <w:r>
+        <w:t xml:space="preserve"> </w:t>
+      </w:r>
+      <w:r>
+        <w:rPr>
+          <w:rStyle w:val="VerbatimChar"/>
+        </w:rPr>
+        <w:t xml:space="preserve">/topic/paper/{id}/comments</w:t>
+      </w:r>
+      <w:r>
+        <w:t xml:space="preserve"> </w:t>
+      </w:r>
+      <w:r>
+        <w:t xml:space="preserve">với</w:t>
+      </w:r>
+      <w:r>
+        <w:t xml:space="preserve"> </w:t>
+      </w:r>
+      <w:r>
+        <w:rPr>
+          <w:rStyle w:val="VerbatimChar"/>
+        </w:rPr>
+        <w:t xml:space="preserve">{type: CREATED|UPDATED|DELETED, comment, commentId}</w:t>
+      </w:r>
+      <w:r>
+        <w:t xml:space="preserve">. Lỗi (không phải thành viên</w:t>
       </w:r>
       <w:r>
         <w:t xml:space="preserve"> </w:t>

</xml_diff>

<commit_message>
Module giao bài và chấm bài: hoàn thiện trả bài / yêu cầu sửa, chạy lại toàn bộ kiểm thử của module
</commit_message>
<xml_diff>
--- a/docx/05-api.docx
+++ b/docx/05-api.docx
@@ -13791,7 +13791,236 @@
         </w:numPr>
       </w:pPr>
       <w:r>
-        <w:t xml:space="preserve">Chưa làm (B25c-3 / B25e): hàng đợi chấm vẫn hiện điểm làm tròn kiểu IELTS và chưa ghi tên nhóm; kết quả phía sinh viên chưa hiện điểm riêng của mình.</w:t>
+        <w:t xml:space="preserve">Hàng đợi (B25c-3):</w:t>
+      </w:r>
+      <w:r>
+        <w:t xml:space="preserve"> </w:t>
+      </w:r>
+      <w:r>
+        <w:rPr>
+          <w:rStyle w:val="VerbatimChar"/>
+        </w:rPr>
+        <w:t xml:space="preserve">QueueRow</w:t>
+      </w:r>
+      <w:r>
+        <w:t xml:space="preserve"> </w:t>
+      </w:r>
+      <w:r>
+        <w:t xml:space="preserve">thêm</w:t>
+      </w:r>
+      <w:r>
+        <w:t xml:space="preserve"> </w:t>
+      </w:r>
+      <w:r>
+        <w:rPr>
+          <w:rStyle w:val="VerbatimChar"/>
+        </w:rPr>
+        <w:t xml:space="preserve">kind</w:t>
+      </w:r>
+      <w:r>
+        <w:t xml:space="preserve"> </w:t>
+      </w:r>
+      <w:r>
+        <w:t xml:space="preserve">và</w:t>
+      </w:r>
+      <w:r>
+        <w:t xml:space="preserve"> </w:t>
+      </w:r>
+      <w:r>
+        <w:rPr>
+          <w:rStyle w:val="VerbatimChar"/>
+        </w:rPr>
+        <w:t xml:space="preserve">groupName</w:t>
+      </w:r>
+      <w:r>
+        <w:t xml:space="preserve"> </w:t>
+      </w:r>
+      <w:r>
+        <w:t xml:space="preserve">(bài PAPER — tên nhóm,</w:t>
+      </w:r>
+      <w:r>
+        <w:t xml:space="preserve"> </w:t>
+      </w:r>
+      <w:r>
+        <w:rPr>
+          <w:rStyle w:val="VerbatimChar"/>
+        </w:rPr>
+        <w:t xml:space="preserve">student</w:t>
+      </w:r>
+      <w:r>
+        <w:t xml:space="preserve"> </w:t>
+      </w:r>
+      <w:r>
+        <w:t xml:space="preserve">là người nộp gần nhất; bài luận null);</w:t>
+      </w:r>
+      <w:r>
+        <w:t xml:space="preserve"> </w:t>
+      </w:r>
+      <w:r>
+        <w:rPr>
+          <w:rStyle w:val="VerbatimChar"/>
+        </w:rPr>
+        <w:t xml:space="preserve">band</w:t>
+      </w:r>
+      <w:r>
+        <w:t xml:space="preserve"> </w:t>
+      </w:r>
+      <w:r>
+        <w:t xml:space="preserve">của bài PAPER là điểm thang 10 làm tròn 2 chữ số.</w:t>
+      </w:r>
+      <w:r>
+        <w:t xml:space="preserve"> </w:t>
+      </w:r>
+      <w:r>
+        <w:rPr>
+          <w:rStyle w:val="VerbatimChar"/>
+        </w:rPr>
+        <w:t xml:space="preserve">keyword</w:t>
+      </w:r>
+      <w:r>
+        <w:t xml:space="preserve"> </w:t>
+      </w:r>
+      <w:r>
+        <w:t xml:space="preserve">tìm thêm theo tên nhóm.</w:t>
+      </w:r>
+    </w:p>
+    <w:p>
+      <w:pPr>
+        <w:pStyle w:val="Compact"/>
+        <w:numPr>
+          <w:ilvl w:val="0"/>
+          <w:numId w:val="1015"/>
+        </w:numPr>
+      </w:pPr>
+      <w:r>
+        <w:t xml:space="preserve">Kết quả phía sinh viên (B25e):</w:t>
+      </w:r>
+      <w:r>
+        <w:t xml:space="preserve"> </w:t>
+      </w:r>
+      <w:r>
+        <w:rPr>
+          <w:rStyle w:val="VerbatimChar"/>
+        </w:rPr>
+        <w:t xml:space="preserve">Result</w:t>
+      </w:r>
+      <w:r>
+        <w:t xml:space="preserve"> </w:t>
+      </w:r>
+      <w:r>
+        <w:t xml:space="preserve">thêm</w:t>
+      </w:r>
+      <w:r>
+        <w:t xml:space="preserve"> </w:t>
+      </w:r>
+      <w:r>
+        <w:rPr>
+          <w:rStyle w:val="VerbatimChar"/>
+        </w:rPr>
+        <w:t xml:space="preserve">myScore</w:t>
+      </w:r>
+      <w:r>
+        <w:t xml:space="preserve"> </w:t>
+      </w:r>
+      <w:r>
+        <w:t xml:space="preserve">(điểm riêng = điểm nhóm + cộng / trừ, kẹp [0, 10]),</w:t>
+      </w:r>
+      <w:r>
+        <w:t xml:space="preserve"> </w:t>
+      </w:r>
+      <w:r>
+        <w:rPr>
+          <w:rStyle w:val="VerbatimChar"/>
+        </w:rPr>
+        <w:t xml:space="preserve">myAdjustment</w:t>
+      </w:r>
+      <w:r>
+        <w:t xml:space="preserve">,</w:t>
+      </w:r>
+      <w:r>
+        <w:t xml:space="preserve"> </w:t>
+      </w:r>
+      <w:r>
+        <w:rPr>
+          <w:rStyle w:val="VerbatimChar"/>
+        </w:rPr>
+        <w:t xml:space="preserve">myAdjustmentReason</w:t>
+      </w:r>
+      <w:r>
+        <w:t xml:space="preserve"> </w:t>
+      </w:r>
+      <w:r>
+        <w:t xml:space="preserve">(bài luận null);</w:t>
+      </w:r>
+      <w:r>
+        <w:t xml:space="preserve"> </w:t>
+      </w:r>
+      <w:r>
+        <w:rPr>
+          <w:rStyle w:val="VerbatimChar"/>
+        </w:rPr>
+        <w:t xml:space="preserve">band</w:t>
+      </w:r>
+      <w:r>
+        <w:t xml:space="preserve"> </w:t>
+      </w:r>
+      <w:r>
+        <w:t xml:space="preserve">của bài PAPER là điểm nhóm thang 10. Lịch sử nộp (</w:t>
+      </w:r>
+      <w:r>
+        <w:rPr>
+          <w:rStyle w:val="VerbatimChar"/>
+        </w:rPr>
+        <w:t xml:space="preserve">VersionSummary.band</w:t>
+      </w:r>
+      <w:r>
+        <w:t xml:space="preserve">),</w:t>
+      </w:r>
+      <w:r>
+        <w:t xml:space="preserve"> </w:t>
+      </w:r>
+      <w:r>
+        <w:rPr>
+          <w:rStyle w:val="VerbatimChar"/>
+        </w:rPr>
+        <w:t xml:space="preserve">PartResult.band</w:t>
+      </w:r>
+      <w:r>
+        <w:t xml:space="preserve"> </w:t>
+      </w:r>
+      <w:r>
+        <w:t xml:space="preserve">và tổng bài của bài PAPER dùng</w:t>
+      </w:r>
+      <w:r>
+        <w:t xml:space="preserve"> </w:t>
+      </w:r>
+      <w:r>
+        <w:rPr>
+          <w:b/>
+          <w:bCs/>
+        </w:rPr>
+        <w:t xml:space="preserve">điểm riêng</w:t>
+      </w:r>
+      <w:r>
+        <w:t xml:space="preserve"> </w:t>
+      </w:r>
+      <w:r>
+        <w:t xml:space="preserve">của sinh viên;</w:t>
+      </w:r>
+      <w:r>
+        <w:t xml:space="preserve"> </w:t>
+      </w:r>
+      <w:r>
+        <w:rPr>
+          <w:rStyle w:val="VerbatimChar"/>
+        </w:rPr>
+        <w:t xml:space="preserve">note</w:t>
+      </w:r>
+      <w:r>
+        <w:t xml:space="preserve"> </w:t>
+      </w:r>
+      <w:r>
+        <w:t xml:space="preserve">ghi cách tính thang 10.</w:t>
       </w:r>
     </w:p>
     <w:p>
@@ -14034,7 +14263,7 @@
         <w:rPr>
           <w:rStyle w:val="VerbatimChar"/>
         </w:rPr>
-        <w:t xml:space="preserve">{submissionId, status, currentVersion, student{id, studentCode, fullName}, assignmentId, assignmentTitle, partId, partTitle, partOrderNo, taskType, submittedAt, late, wordCount, gradeStatus, band}</w:t>
+        <w:t xml:space="preserve">{submissionId, status, currentVersion, student{id, studentCode, fullName}, assignmentId, assignmentTitle, partId, partTitle, partOrderNo, taskType, submittedAt, late, wordCount, gradeStatus, band, kind, groupName}</w:t>
       </w:r>
       <w:r>
         <w:t xml:space="preserve"> </w:t>

</xml_diff>

<commit_message>
Thống kê tính bài Paper theo điểm riêng từng thành viên; bộ giới hạn tần suất đếm nguyên tử
- CTE latest dùng submission_members: bài nhóm có một dòng cho mỗi thành viên, điểm = điểm cả bài làm tròn
  2 chữ số + cộng / trừ, kẹp [0, 10] (BR-31)
- Thống kê một bài: đếm nộp / trả theo người, phân bố theo nửa điểm, trung bình tiêu chí không nhân theo số
  thành viên, tiêu chí kèm maxScore
- Thống kê lớp, kết quả học tập, Excel: bài PAPER hiện điểm thang 10 (kind / paper), không gộp vào band
  trung bình, biểu đồ band hay xếp hạng IELTS
- SlidingWindowLimiter.tryAcquire nguyên tử cho thi, tra DOI, tài liệu Paper, nháp trực tiếp — sửa test
  chập chờn LiveIntegrationTest.ignoredUpdates
- docs/05, docs/12 + Word; backend 600 / 600, frontend 141 / 141

Co-Authored-By: Claude Opus 5.5 <noreply@anthropic.com>
</commit_message>
<xml_diff>
--- a/docx/05-api.docx
+++ b/docx/05-api.docx
@@ -10953,7 +10953,22 @@
         <w:t xml:space="preserve"> </w:t>
       </w:r>
       <w:r>
-        <w:t xml:space="preserve">(không phải 0).</w:t>
+        <w:t xml:space="preserve">(không phải 0). Mỗi tiêu chí kèm</w:t>
+      </w:r>
+      <w:r>
+        <w:t xml:space="preserve"> </w:t>
+      </w:r>
+      <w:r>
+        <w:rPr>
+          <w:rStyle w:val="VerbatimChar"/>
+        </w:rPr>
+        <w:t xml:space="preserve">maxScore</w:t>
+      </w:r>
+      <w:r>
+        <w:t xml:space="preserve"> </w:t>
+      </w:r>
+      <w:r>
+        <w:t xml:space="preserve">(IELTS 9; bài PAPER theo rubric).</w:t>
       </w:r>
     </w:p>
     <w:p>
@@ -10965,6 +10980,110 @@
         </w:numPr>
       </w:pPr>
       <w:r>
+        <w:rPr>
+          <w:b/>
+          <w:bCs/>
+        </w:rPr>
+        <w:t xml:space="preserve">Bài PAPER (B25e, BR-31):</w:t>
+      </w:r>
+      <w:r>
+        <w:t xml:space="preserve"> </w:t>
+      </w:r>
+      <w:r>
+        <w:t xml:space="preserve">bài làm thuộc nhóm nên tính cho</w:t>
+      </w:r>
+      <w:r>
+        <w:t xml:space="preserve"> </w:t>
+      </w:r>
+      <w:r>
+        <w:rPr>
+          <w:b/>
+          <w:bCs/>
+        </w:rPr>
+        <w:t xml:space="preserve">từng thành viên hiện tại</w:t>
+      </w:r>
+      <w:r>
+        <w:t xml:space="preserve"> </w:t>
+      </w:r>
+      <w:r>
+        <w:t xml:space="preserve">của nhóm (</w:t>
+      </w:r>
+      <w:r>
+        <w:rPr>
+          <w:rStyle w:val="VerbatimChar"/>
+        </w:rPr>
+        <w:t xml:space="preserve">submittedCount</w:t>
+      </w:r>
+      <w:r>
+        <w:t xml:space="preserve">,</w:t>
+      </w:r>
+      <w:r>
+        <w:t xml:space="preserve"> </w:t>
+      </w:r>
+      <w:r>
+        <w:rPr>
+          <w:rStyle w:val="VerbatimChar"/>
+        </w:rPr>
+        <w:t xml:space="preserve">returnedCount</w:t>
+      </w:r>
+      <w:r>
+        <w:t xml:space="preserve">,</w:t>
+      </w:r>
+      <w:r>
+        <w:t xml:space="preserve"> </w:t>
+      </w:r>
+      <w:r>
+        <w:rPr>
+          <w:rStyle w:val="VerbatimChar"/>
+        </w:rPr>
+        <w:t xml:space="preserve">overall.count</w:t>
+      </w:r>
+      <w:r>
+        <w:t xml:space="preserve"> </w:t>
+      </w:r>
+      <w:r>
+        <w:t xml:space="preserve">đếm theo người). Điểm của mỗi người = điểm cả bài làm tròn 2 chữ số + cộng / trừ riêng, kẹp [0, 10];</w:t>
+      </w:r>
+      <w:r>
+        <w:t xml:space="preserve"> </w:t>
+      </w:r>
+      <w:r>
+        <w:rPr>
+          <w:rStyle w:val="VerbatimChar"/>
+        </w:rPr>
+        <w:t xml:space="preserve">averageBand</w:t>
+      </w:r>
+      <w:r>
+        <w:t xml:space="preserve"> </w:t>
+      </w:r>
+      <w:r>
+        <w:t xml:space="preserve">là trung bình điểm thang 10,</w:t>
+      </w:r>
+      <w:r>
+        <w:t xml:space="preserve"> </w:t>
+      </w:r>
+      <w:r>
+        <w:rPr>
+          <w:rStyle w:val="VerbatimChar"/>
+        </w:rPr>
+        <w:t xml:space="preserve">bandDistribution</w:t>
+      </w:r>
+      <w:r>
+        <w:t xml:space="preserve"> </w:t>
+      </w:r>
+      <w:r>
+        <w:t xml:space="preserve">gom theo nửa điểm gần nhất (7.67 → 7.5). Trung bình tiêu chí tính một lần cho mỗi bài chấm của nhóm (không nhân theo số thành viên).</w:t>
+      </w:r>
+    </w:p>
+    <w:p>
+      <w:pPr>
+        <w:pStyle w:val="Compact"/>
+        <w:numPr>
+          <w:ilvl w:val="0"/>
+          <w:numId w:val="1011"/>
+        </w:numPr>
+      </w:pPr>
+      <w:r>
         <w:t xml:space="preserve">Bài của giáo viên khác →</w:t>
       </w:r>
       <w:r>
@@ -11063,7 +11182,7 @@
         <w:rPr>
           <w:rStyle w:val="VerbatimChar"/>
         </w:rPr>
-        <w:t xml:space="preserve">      "criteria": [ { "criterionId": 51, "code": "TR", "name": "Task Response", "average": 5.93, "count": 35 } ],</w:t>
+        <w:t xml:space="preserve">      "criteria": [ { "criterionId": 51, "code": "TR", "name": "Task Response", "maxScore": 9.0, "average": 5.93, "count": 35 } ],</w:t>
       </w:r>
       <w:r>
         <w:br/>
@@ -11394,6 +11513,79 @@
         </w:numPr>
       </w:pPr>
       <w:r>
+        <w:rPr>
+          <w:b/>
+          <w:bCs/>
+        </w:rPr>
+        <w:t xml:space="preserve">Bài PAPER (B25e):</w:t>
+      </w:r>
+      <w:r>
+        <w:t xml:space="preserve"> </w:t>
+      </w:r>
+      <w:r>
+        <w:t xml:space="preserve">cột ghi</w:t>
+      </w:r>
+      <w:r>
+        <w:t xml:space="preserve"> </w:t>
+      </w:r>
+      <w:r>
+        <w:rPr>
+          <w:rStyle w:val="VerbatimChar"/>
+        </w:rPr>
+        <w:t xml:space="preserve">Điểm</w:t>
+      </w:r>
+      <w:r>
+        <w:t xml:space="preserve"> </w:t>
+      </w:r>
+      <w:r>
+        <w:t xml:space="preserve">thay cho</w:t>
+      </w:r>
+      <w:r>
+        <w:t xml:space="preserve"> </w:t>
+      </w:r>
+      <w:r>
+        <w:rPr>
+          <w:rStyle w:val="VerbatimChar"/>
+        </w:rPr>
+        <w:t xml:space="preserve">Band</w:t>
+      </w:r>
+      <w:r>
+        <w:t xml:space="preserve"> </w:t>
+      </w:r>
+      <w:r>
+        <w:t xml:space="preserve">(</w:t>
+      </w:r>
+      <w:r>
+        <w:rPr>
+          <w:rStyle w:val="VerbatimChar"/>
+        </w:rPr>
+        <w:t xml:space="preserve">&lt;phần&gt; – Điểm</w:t>
+      </w:r>
+      <w:r>
+        <w:t xml:space="preserve">,</w:t>
+      </w:r>
+      <w:r>
+        <w:t xml:space="preserve"> </w:t>
+      </w:r>
+      <w:r>
+        <w:rPr>
+          <w:rStyle w:val="VerbatimChar"/>
+        </w:rPr>
+        <w:t xml:space="preserve">Điểm cả bài</w:t>
+      </w:r>
+      <w:r>
+        <w:t xml:space="preserve">), định dạng 2 chữ số; điểm của mỗi thành viên = điểm nhóm + cộng / trừ riêng, kẹp [0, 10].</w:t>
+      </w:r>
+    </w:p>
+    <w:p>
+      <w:pPr>
+        <w:pStyle w:val="Compact"/>
+        <w:numPr>
+          <w:ilvl w:val="0"/>
+          <w:numId w:val="1012"/>
+        </w:numPr>
+      </w:pPr>
+      <w:r>
         <w:t xml:space="preserve">Bài của người khác →</w:t>
       </w:r>
       <w:r>
@@ -11763,6 +11955,158 @@
         </w:numPr>
       </w:pPr>
       <w:r>
+        <w:rPr>
+          <w:b/>
+          <w:bCs/>
+        </w:rPr>
+        <w:t xml:space="preserve">Bài PAPER (B25e):</w:t>
+      </w:r>
+      <w:r>
+        <w:t xml:space="preserve"> </w:t>
+      </w:r>
+      <w:r>
+        <w:t xml:space="preserve">mỗi bài trong</w:t>
+      </w:r>
+      <w:r>
+        <w:t xml:space="preserve"> </w:t>
+      </w:r>
+      <w:r>
+        <w:rPr>
+          <w:rStyle w:val="VerbatimChar"/>
+        </w:rPr>
+        <w:t xml:space="preserve">assignments[]</w:t>
+      </w:r>
+      <w:r>
+        <w:t xml:space="preserve"> </w:t>
+      </w:r>
+      <w:r>
+        <w:t xml:space="preserve">có</w:t>
+      </w:r>
+      <w:r>
+        <w:t xml:space="preserve"> </w:t>
+      </w:r>
+      <w:r>
+        <w:rPr>
+          <w:rStyle w:val="VerbatimChar"/>
+        </w:rPr>
+        <w:t xml:space="preserve">kind</w:t>
+      </w:r>
+      <w:r>
+        <w:t xml:space="preserve">. Bài</w:t>
+      </w:r>
+      <w:r>
+        <w:t xml:space="preserve"> </w:t>
+      </w:r>
+      <w:r>
+        <w:rPr>
+          <w:rStyle w:val="VerbatimChar"/>
+        </w:rPr>
+        <w:t xml:space="preserve">PAPER</w:t>
+      </w:r>
+      <w:r>
+        <w:t xml:space="preserve"> </w:t>
+      </w:r>
+      <w:r>
+        <w:t xml:space="preserve">tính cho mọi thành viên nhóm theo điểm riêng thang 10 (như thống kê một bài):</w:t>
+      </w:r>
+      <w:r>
+        <w:t xml:space="preserve"> </w:t>
+      </w:r>
+      <w:r>
+        <w:rPr>
+          <w:rStyle w:val="VerbatimChar"/>
+        </w:rPr>
+        <w:t xml:space="preserve">assignments[].averageBand</w:t>
+      </w:r>
+      <w:r>
+        <w:t xml:space="preserve"> </w:t>
+      </w:r>
+      <w:r>
+        <w:t xml:space="preserve">và</w:t>
+      </w:r>
+      <w:r>
+        <w:t xml:space="preserve"> </w:t>
+      </w:r>
+      <w:r>
+        <w:rPr>
+          <w:rStyle w:val="VerbatimChar"/>
+        </w:rPr>
+        <w:t xml:space="preserve">assignmentBands</w:t>
+      </w:r>
+      <w:r>
+        <w:t xml:space="preserve"> </w:t>
+      </w:r>
+      <w:r>
+        <w:t xml:space="preserve">của bài đó là điểm thang 10. Điểm thang 10</w:t>
+      </w:r>
+      <w:r>
+        <w:t xml:space="preserve"> </w:t>
+      </w:r>
+      <w:r>
+        <w:rPr>
+          <w:b/>
+          <w:bCs/>
+        </w:rPr>
+        <w:t xml:space="preserve">không</w:t>
+      </w:r>
+      <w:r>
+        <w:t xml:space="preserve"> </w:t>
+      </w:r>
+      <w:r>
+        <w:t xml:space="preserve">gộp vào</w:t>
+      </w:r>
+      <w:r>
+        <w:t xml:space="preserve"> </w:t>
+      </w:r>
+      <w:r>
+        <w:rPr>
+          <w:rStyle w:val="VerbatimChar"/>
+        </w:rPr>
+        <w:t xml:space="preserve">averageBand</w:t>
+      </w:r>
+      <w:r>
+        <w:t xml:space="preserve"> </w:t>
+      </w:r>
+      <w:r>
+        <w:t xml:space="preserve">của lớp,</w:t>
+      </w:r>
+      <w:r>
+        <w:t xml:space="preserve"> </w:t>
+      </w:r>
+      <w:r>
+        <w:rPr>
+          <w:rStyle w:val="VerbatimChar"/>
+        </w:rPr>
+        <w:t xml:space="preserve">ranking[].averageBand</w:t>
+      </w:r>
+      <w:r>
+        <w:t xml:space="preserve">,</w:t>
+      </w:r>
+      <w:r>
+        <w:t xml:space="preserve"> </w:t>
+      </w:r>
+      <w:r>
+        <w:rPr>
+          <w:rStyle w:val="VerbatimChar"/>
+        </w:rPr>
+        <w:t xml:space="preserve">gradedAssignments</w:t>
+      </w:r>
+      <w:r>
+        <w:t xml:space="preserve"> </w:t>
+      </w:r>
+      <w:r>
+        <w:t xml:space="preserve">hay thứ hạng (khác thang với band IELTS).</w:t>
+      </w:r>
+    </w:p>
+    <w:p>
+      <w:pPr>
+        <w:pStyle w:val="Compact"/>
+        <w:numPr>
+          <w:ilvl w:val="0"/>
+          <w:numId w:val="1013"/>
+        </w:numPr>
+      </w:pPr>
+      <w:r>
         <w:t xml:space="preserve">Lớp của giáo viên khác →</w:t>
       </w:r>
       <w:r>
@@ -11831,7 +12175,7 @@
         <w:rPr>
           <w:rStyle w:val="VerbatimChar"/>
         </w:rPr>
-        <w:t xml:space="preserve">                     "partCount": 2, "completedCount": 40, "completedRate": 0.8889, "gradedCount": 38, "averageBand": 6.04 } ],</w:t>
+        <w:t xml:space="preserve">                     "kind": "ESSAY", "partCount": 2, "completedCount": 40, "completedRate": 0.8889, "gradedCount": 38, "averageBand": 6.04 } ],</w:t>
       </w:r>
       <w:r>
         <w:br/>
@@ -18898,6 +19242,152 @@
       </w:pPr>
       <w:r>
         <w:rPr>
+          <w:b/>
+          <w:bCs/>
+        </w:rPr>
+        <w:t xml:space="preserve">Bài PAPER (B25e):</w:t>
+      </w:r>
+      <w:r>
+        <w:t xml:space="preserve"> </w:t>
+      </w:r>
+      <w:r>
+        <w:t xml:space="preserve">bài nhóm tính cho mọi thành viên (</w:t>
+      </w:r>
+      <w:r>
+        <w:rPr>
+          <w:rStyle w:val="VerbatimChar"/>
+        </w:rPr>
+        <w:t xml:space="preserve">submittedCount</w:t>
+      </w:r>
+      <w:r>
+        <w:t xml:space="preserve">,</w:t>
+      </w:r>
+      <w:r>
+        <w:t xml:space="preserve"> </w:t>
+      </w:r>
+      <w:r>
+        <w:rPr>
+          <w:rStyle w:val="VerbatimChar"/>
+        </w:rPr>
+        <w:t xml:space="preserve">lateCount</w:t>
+      </w:r>
+      <w:r>
+        <w:t xml:space="preserve"> </w:t>
+      </w:r>
+      <w:r>
+        <w:t xml:space="preserve">gồm cả phần nhóm đã nộp). Dòng</w:t>
+      </w:r>
+      <w:r>
+        <w:t xml:space="preserve"> </w:t>
+      </w:r>
+      <w:r>
+        <w:rPr>
+          <w:rStyle w:val="VerbatimChar"/>
+        </w:rPr>
+        <w:t xml:space="preserve">assignments</w:t>
+      </w:r>
+      <w:r>
+        <w:t xml:space="preserve"> </w:t>
+      </w:r>
+      <w:r>
+        <w:t xml:space="preserve">/</w:t>
+      </w:r>
+      <w:r>
+        <w:t xml:space="preserve"> </w:t>
+      </w:r>
+      <w:r>
+        <w:rPr>
+          <w:rStyle w:val="VerbatimChar"/>
+        </w:rPr>
+        <w:t xml:space="preserve">parts</w:t>
+      </w:r>
+      <w:r>
+        <w:t xml:space="preserve"> </w:t>
+      </w:r>
+      <w:r>
+        <w:t xml:space="preserve">của bài PAPER có</w:t>
+      </w:r>
+      <w:r>
+        <w:t xml:space="preserve"> </w:t>
+      </w:r>
+      <w:r>
+        <w:rPr>
+          <w:rStyle w:val="VerbatimChar"/>
+        </w:rPr>
+        <w:t xml:space="preserve">paper = true</w:t>
+      </w:r>
+      <w:r>
+        <w:t xml:space="preserve">,</w:t>
+      </w:r>
+      <w:r>
+        <w:t xml:space="preserve"> </w:t>
+      </w:r>
+      <w:r>
+        <w:rPr>
+          <w:rStyle w:val="VerbatimChar"/>
+        </w:rPr>
+        <w:t xml:space="preserve">band</w:t>
+      </w:r>
+      <w:r>
+        <w:t xml:space="preserve"> </w:t>
+      </w:r>
+      <w:r>
+        <w:t xml:space="preserve">là</w:t>
+      </w:r>
+      <w:r>
+        <w:t xml:space="preserve"> </w:t>
+      </w:r>
+      <w:r>
+        <w:rPr>
+          <w:b/>
+          <w:bCs/>
+        </w:rPr>
+        <w:t xml:space="preserve">điểm riêng thang 10</w:t>
+      </w:r>
+      <w:r>
+        <w:t xml:space="preserve"> </w:t>
+      </w:r>
+      <w:r>
+        <w:t xml:space="preserve">(2 chữ số, đã gồm cộng / trừ); không gộp vào</w:t>
+      </w:r>
+      <w:r>
+        <w:t xml:space="preserve"> </w:t>
+      </w:r>
+      <w:r>
+        <w:rPr>
+          <w:rStyle w:val="VerbatimChar"/>
+        </w:rPr>
+        <w:t xml:space="preserve">averageBand</w:t>
+      </w:r>
+      <w:r>
+        <w:t xml:space="preserve"> </w:t>
+      </w:r>
+      <w:r>
+        <w:t xml:space="preserve">và không vẽ trên biểu đồ band. Bài luận:</w:t>
+      </w:r>
+      <w:r>
+        <w:t xml:space="preserve"> </w:t>
+      </w:r>
+      <w:r>
+        <w:rPr>
+          <w:rStyle w:val="VerbatimChar"/>
+        </w:rPr>
+        <w:t xml:space="preserve">paper = false</w:t>
+      </w:r>
+      <w:r>
+        <w:t xml:space="preserve">.</w:t>
+      </w:r>
+    </w:p>
+    <w:p>
+      <w:pPr>
+        <w:pStyle w:val="Compact"/>
+        <w:numPr>
+          <w:ilvl w:val="0"/>
+          <w:numId w:val="1026"/>
+        </w:numPr>
+      </w:pPr>
+      <w:r>
+        <w:rPr>
           <w:rStyle w:val="VerbatimChar"/>
         </w:rPr>
         <w:t xml:space="preserve">errorProfile</w:t>
@@ -18978,7 +19468,7 @@
         <w:rPr>
           <w:rStyle w:val="VerbatimChar"/>
         </w:rPr>
-        <w:t xml:space="preserve">                     "band": 6.0, "returnedAt": "2026-11-09T03:00:00Z" } ],</w:t>
+        <w:t xml:space="preserve">                     "band": 6.0, "returnedAt": "2026-11-09T03:00:00Z", "paper": false } ],</w:t>
       </w:r>
       <w:r>
         <w:br/>
@@ -18996,7 +19486,7 @@
         <w:rPr>
           <w:rStyle w:val="VerbatimChar"/>
         </w:rPr>
-        <w:t xml:space="preserve">               "taskType": "WRITING_TASK1", "band": 5.5, "returnedAt": "2026-11-08T03:00:00Z" } ],</w:t>
+        <w:t xml:space="preserve">               "taskType": "WRITING_TASK1", "band": 5.5, "returnedAt": "2026-11-08T03:00:00Z", "paper": false } ],</w:t>
       </w:r>
       <w:r>
         <w:br/>

</xml_diff>

<commit_message>
Đánh dấu trên bản Paper có định dạng và so sánh lần nộp cho bài Paper (B25d)
- docTextPositions: dựng lại chữ thuần (giống docText) từ tài liệu ProseMirror kèm vị trí từng ký tự;
  offsetsToRange / rangeToOffsets quy đổi giữa offset trên content và vị trí ProseMirror
- PaperViewer nhận annotate: tô đánh dấu bằng decoration, bấm để chọn, bôi đen ra thanh công cụ
  (Lỗi / Đánh dấu / Tốt / Nhận xét), thẻ chi tiết; chữ dựng lại lệch content thì chỉ hiện danh sách
- Màn chấm bật lại tab Đánh dấu và So sánh với lần trước cho bài PAPER; sinh viên thấy đánh dấu ở màn kết quả
- Test: quy đổi vị trí (unit), nhận xét inline bài PAPER neo trên chữ thuần (tích hợp)
- docs/05, docs/12 + Word; frontend 144 / 144

Co-Authored-By: Claude Opus 5.5 <noreply@anthropic.com>
</commit_message>
<xml_diff>
--- a/docx/05-api.docx
+++ b/docx/05-api.docx
@@ -16177,6 +16177,157 @@
           <w:rStyle w:val="VerbatimChar"/>
         </w:rPr>
         <w:t xml:space="preserve">// → data: GradeDto (như "grade" ở trên)</w:t>
+      </w:r>
+    </w:p>
+    <w:p>
+      <w:pPr>
+        <w:pStyle w:val="FirstParagraph"/>
+      </w:pPr>
+      <w:r>
+        <w:rPr>
+          <w:b/>
+          <w:bCs/>
+        </w:rPr>
+        <w:t xml:space="preserve">Nhận xét inline bài PAPER (B25d):</w:t>
+      </w:r>
+      <w:r>
+        <w:t xml:space="preserve"> </w:t>
+      </w:r>
+      <w:r>
+        <w:t xml:space="preserve">cùng API, cùng quy tắc với bài luận — offset tính trên</w:t>
+      </w:r>
+      <w:r>
+        <w:t xml:space="preserve"> </w:t>
+      </w:r>
+      <w:r>
+        <w:rPr>
+          <w:rStyle w:val="VerbatimChar"/>
+        </w:rPr>
+        <w:t xml:space="preserve">version.content</w:t>
+      </w:r>
+      <w:r>
+        <w:t xml:space="preserve"> </w:t>
+      </w:r>
+      <w:r>
+        <w:t xml:space="preserve">là</w:t>
+      </w:r>
+      <w:r>
+        <w:t xml:space="preserve"> </w:t>
+      </w:r>
+      <w:r>
+        <w:rPr>
+          <w:b/>
+          <w:bCs/>
+        </w:rPr>
+        <w:t xml:space="preserve">chữ thuần</w:t>
+      </w:r>
+      <w:r>
+        <w:t xml:space="preserve"> </w:t>
+      </w:r>
+      <w:r>
+        <w:t xml:space="preserve">của lần nộp (tiêu đề mục + nội dung, do</w:t>
+      </w:r>
+      <w:r>
+        <w:t xml:space="preserve"> </w:t>
+      </w:r>
+      <w:r>
+        <w:rPr>
+          <w:rStyle w:val="VerbatimChar"/>
+        </w:rPr>
+        <w:t xml:space="preserve">docText</w:t>
+      </w:r>
+      <w:r>
+        <w:t xml:space="preserve"> </w:t>
+      </w:r>
+      <w:r>
+        <w:t xml:space="preserve">dựng từ</w:t>
+      </w:r>
+      <w:r>
+        <w:t xml:space="preserve"> </w:t>
+      </w:r>
+      <w:r>
+        <w:rPr>
+          <w:rStyle w:val="VerbatimChar"/>
+        </w:rPr>
+        <w:t xml:space="preserve">contentJson</w:t>
+      </w:r>
+      <w:r>
+        <w:t xml:space="preserve"> </w:t>
+      </w:r>
+      <w:r>
+        <w:t xml:space="preserve">lúc nộp). Màn chấm / màn kết quả dựng lại bảng vị trí từ</w:t>
+      </w:r>
+      <w:r>
+        <w:t xml:space="preserve"> </w:t>
+      </w:r>
+      <w:r>
+        <w:rPr>
+          <w:rStyle w:val="VerbatimChar"/>
+        </w:rPr>
+        <w:t xml:space="preserve">contentJson</w:t>
+      </w:r>
+      <w:r>
+        <w:t xml:space="preserve"> </w:t>
+      </w:r>
+      <w:r>
+        <w:t xml:space="preserve">để tô trên bản có định dạng; chữ dựng lại khác</w:t>
+      </w:r>
+      <w:r>
+        <w:t xml:space="preserve"> </w:t>
+      </w:r>
+      <w:r>
+        <w:rPr>
+          <w:rStyle w:val="VerbatimChar"/>
+        </w:rPr>
+        <w:t xml:space="preserve">content</w:t>
+      </w:r>
+      <w:r>
+        <w:t xml:space="preserve"> </w:t>
+      </w:r>
+      <w:r>
+        <w:t xml:space="preserve">thì chỉ hiện danh sách đánh dấu. Bài PAPER chỉ dùng</w:t>
+      </w:r>
+      <w:r>
+        <w:t xml:space="preserve"> </w:t>
+      </w:r>
+      <w:r>
+        <w:rPr>
+          <w:rStyle w:val="VerbatimChar"/>
+        </w:rPr>
+        <w:t xml:space="preserve">kind</w:t>
+      </w:r>
+      <w:r>
+        <w:t xml:space="preserve"> </w:t>
+      </w:r>
+      <w:r>
+        <w:t xml:space="preserve">ERROR / HIGHLIGHT / GOOD / COMMENT, không dùng</w:t>
+      </w:r>
+      <w:r>
+        <w:t xml:space="preserve"> </w:t>
+      </w:r>
+      <w:r>
+        <w:rPr>
+          <w:rStyle w:val="VerbatimChar"/>
+        </w:rPr>
+        <w:t xml:space="preserve">edit</w:t>
+      </w:r>
+      <w:r>
+        <w:t xml:space="preserve"> </w:t>
+      </w:r>
+      <w:r>
+        <w:t xml:space="preserve">(bản có định dạng không vẽ chữ thay thế). So sánh lần nộp và đánh giá "đã sửa" (BR-21) dùng chung với bài luận, trên</w:t>
+      </w:r>
+      <w:r>
+        <w:t xml:space="preserve"> </w:t>
+      </w:r>
+      <w:r>
+        <w:rPr>
+          <w:rStyle w:val="VerbatimChar"/>
+        </w:rPr>
+        <w:t xml:space="preserve">content</w:t>
+      </w:r>
+      <w:r>
+        <w:t xml:space="preserve">.</w:t>
       </w:r>
     </w:p>
     <w:p>

</xml_diff>